<commit_message>
parte d y ajustes del archivo
</commit_message>
<xml_diff>
--- a/Sistemas operativos practica 3.docx
+++ b/Sistemas operativos practica 3.docx
@@ -1,6 +1,6 @@
 
 <file path=word/document.xml><?xml version="1.0" encoding="utf-8"?>
-<w:document xmlns:wpc="http://schemas.microsoft.com/office/word/2010/wordprocessingCanvas" xmlns:cx="http://schemas.microsoft.com/office/drawing/2014/chartex" xmlns:cx1="http://schemas.microsoft.com/office/drawing/2015/9/8/chartex" xmlns:cx2="http://schemas.microsoft.com/office/drawing/2015/10/21/chartex" xmlns:cx3="http://schemas.microsoft.com/office/drawing/2016/5/9/chartex" xmlns:cx4="http://schemas.microsoft.com/office/drawing/2016/5/10/chartex" xmlns:cx5="http://schemas.microsoft.com/office/drawing/2016/5/11/chartex" xmlns:cx6="http://schemas.microsoft.com/office/drawing/2016/5/12/chartex" xmlns:cx7="http://schemas.microsoft.com/office/drawing/2016/5/13/chartex" xmlns:cx8="http://schemas.microsoft.com/office/drawing/2016/5/14/chartex" xmlns:mc="http://schemas.openxmlformats.org/markup-compatibility/2006" xmlns:aink="http://schemas.microsoft.com/office/drawing/2016/ink" xmlns:am3d="http://schemas.microsoft.com/office/drawing/2017/model3d" xmlns:o="urn:schemas-microsoft-com:office:office" xmlns:oel="http://schemas.microsoft.com/office/2019/extlst" xmlns:r="http://schemas.openxmlformats.org/officeDocument/2006/relationships" xmlns:m="http://schemas.openxmlformats.org/officeDocument/2006/math" xmlns:v="urn:schemas-microsoft-com:vml" xmlns:wp14="http://schemas.microsoft.com/office/word/2010/wordprocessingDrawing" xmlns:wp="http://schemas.openxmlformats.org/drawingml/2006/wordprocessingDrawing" xmlns:w10="urn:schemas-microsoft-com:office:word" xmlns:w="http://schemas.openxmlformats.org/wordprocessingml/2006/main" xmlns:w14="http://schemas.microsoft.com/office/word/2010/wordml" xmlns:w15="http://schemas.microsoft.com/office/word/2012/wordml" xmlns:w16cex="http://schemas.microsoft.com/office/word/2018/wordml/cex" xmlns:w16cid="http://schemas.microsoft.com/office/word/2016/wordml/cid" xmlns:w16="http://schemas.microsoft.com/office/word/2018/wordml" xmlns:w16sdtdh="http://schemas.microsoft.com/office/word/2020/wordml/sdtdatahash" xmlns:w16se="http://schemas.microsoft.com/office/word/2015/wordml/symex" xmlns:wpg="http://schemas.microsoft.com/office/word/2010/wordprocessingGroup" xmlns:wpi="http://schemas.microsoft.com/office/word/2010/wordprocessingInk" xmlns:wne="http://schemas.microsoft.com/office/word/2006/wordml" xmlns:wps="http://schemas.microsoft.com/office/word/2010/wordprocessingShape" mc:Ignorable="w14 w15 w16se w16cid w16 w16cex w16sdtdh wp14">
+<w:document xmlns:wpc="http://schemas.microsoft.com/office/word/2010/wordprocessingCanvas" xmlns:cx="http://schemas.microsoft.com/office/drawing/2014/chartex" xmlns:cx1="http://schemas.microsoft.com/office/drawing/2015/9/8/chartex" xmlns:cx2="http://schemas.microsoft.com/office/drawing/2015/10/21/chartex" xmlns:cx3="http://schemas.microsoft.com/office/drawing/2016/5/9/chartex" xmlns:cx4="http://schemas.microsoft.com/office/drawing/2016/5/10/chartex" xmlns:cx5="http://schemas.microsoft.com/office/drawing/2016/5/11/chartex" xmlns:cx6="http://schemas.microsoft.com/office/drawing/2016/5/12/chartex" xmlns:cx7="http://schemas.microsoft.com/office/drawing/2016/5/13/chartex" xmlns:cx8="http://schemas.microsoft.com/office/drawing/2016/5/14/chartex" xmlns:mc="http://schemas.openxmlformats.org/markup-compatibility/2006" xmlns:aink="http://schemas.microsoft.com/office/drawing/2016/ink" xmlns:am3d="http://schemas.microsoft.com/office/drawing/2017/model3d" xmlns:o="urn:schemas-microsoft-com:office:office" xmlns:oel="http://schemas.microsoft.com/office/2019/extlst" xmlns:r="http://schemas.openxmlformats.org/officeDocument/2006/relationships" xmlns:m="http://schemas.openxmlformats.org/officeDocument/2006/math" xmlns:v="urn:schemas-microsoft-com:vml" xmlns:wp14="http://schemas.microsoft.com/office/word/2010/wordprocessingDrawing" xmlns:wp="http://schemas.openxmlformats.org/drawingml/2006/wordprocessingDrawing" xmlns:w10="urn:schemas-microsoft-com:office:word" xmlns:w="http://schemas.openxmlformats.org/wordprocessingml/2006/main" xmlns:w14="http://schemas.microsoft.com/office/word/2010/wordml" xmlns:w15="http://schemas.microsoft.com/office/word/2012/wordml" xmlns:w16cex="http://schemas.microsoft.com/office/word/2018/wordml/cex" xmlns:w16cid="http://schemas.microsoft.com/office/word/2016/wordml/cid" xmlns:w16="http://schemas.microsoft.com/office/word/2018/wordml" xmlns:w16du="http://schemas.microsoft.com/office/word/2023/wordml/word16du" xmlns:w16sdtdh="http://schemas.microsoft.com/office/word/2020/wordml/sdtdatahash" xmlns:w16sdtfl="http://schemas.microsoft.com/office/word/2024/wordml/sdtformatlock" xmlns:w16se="http://schemas.microsoft.com/office/word/2015/wordml/symex" xmlns:wpg="http://schemas.microsoft.com/office/word/2010/wordprocessingGroup" xmlns:wpi="http://schemas.microsoft.com/office/word/2010/wordprocessingInk" xmlns:wne="http://schemas.microsoft.com/office/word/2006/wordml" xmlns:wps="http://schemas.microsoft.com/office/word/2010/wordprocessingShape" mc:Ignorable="w14 w15 w16se w16cid w16 w16cex w16sdtdh w16sdtfl w16du wp14">
   <w:body>
     <w:p>
       <w:pPr>
@@ -1305,7 +1305,25 @@
           <w:sz w:val="20"/>
           <w:szCs w:val="20"/>
         </w:rPr>
-        <w:t xml:space="preserve">CPU: 2 núcleos con VT-x / AMD-V habilitado (pestaña System &gt; </w:t>
+        <w:t xml:space="preserve">CPU: 2 núcleos con VT-x / AMD-V habilitado (pestaña </w:t>
+      </w:r>
+      <w:proofErr w:type="spellStart"/>
+      <w:r>
+        <w:rPr>
+          <w:rFonts w:ascii="Arial" w:eastAsia="Arial" w:hAnsi="Arial" w:cs="Arial"/>
+          <w:sz w:val="20"/>
+          <w:szCs w:val="20"/>
+        </w:rPr>
+        <w:t>System</w:t>
+      </w:r>
+      <w:proofErr w:type="spellEnd"/>
+      <w:r>
+        <w:rPr>
+          <w:rFonts w:ascii="Arial" w:eastAsia="Arial" w:hAnsi="Arial" w:cs="Arial"/>
+          <w:sz w:val="20"/>
+          <w:szCs w:val="20"/>
+        </w:rPr>
+        <w:t xml:space="preserve"> &gt; </w:t>
       </w:r>
       <w:proofErr w:type="spellStart"/>
       <w:r>
@@ -1650,7 +1668,7 @@
           <w:szCs w:val="20"/>
         </w:rPr>
         <w:drawing>
-          <wp:anchor distT="0" distB="0" distL="114300" distR="114300" simplePos="0" relativeHeight="251660288" behindDoc="0" locked="0" layoutInCell="1" allowOverlap="1" wp14:anchorId="26CB8897" wp14:editId="792AFB20">
+          <wp:anchor distT="0" distB="0" distL="114300" distR="114300" simplePos="0" relativeHeight="251660288" behindDoc="0" locked="0" layoutInCell="1" allowOverlap="1" wp14:anchorId="26CB8897" wp14:editId="14182ACA">
             <wp:simplePos x="0" y="0"/>
             <wp:positionH relativeFrom="margin">
               <wp:posOffset>16048</wp:posOffset>
@@ -2166,7 +2184,25 @@
           <w:sz w:val="20"/>
           <w:szCs w:val="20"/>
         </w:rPr>
-        <w:t xml:space="preserve"> vboxdrv (documentar qué hace este módulo)</w:t>
+        <w:t xml:space="preserve"> </w:t>
+      </w:r>
+      <w:proofErr w:type="spellStart"/>
+      <w:r>
+        <w:rPr>
+          <w:rFonts w:ascii="Arial" w:eastAsia="Arial" w:hAnsi="Arial" w:cs="Arial"/>
+          <w:sz w:val="20"/>
+          <w:szCs w:val="20"/>
+        </w:rPr>
+        <w:t>vboxdrv</w:t>
+      </w:r>
+      <w:proofErr w:type="spellEnd"/>
+      <w:r>
+        <w:rPr>
+          <w:rFonts w:ascii="Arial" w:eastAsia="Arial" w:hAnsi="Arial" w:cs="Arial"/>
+          <w:sz w:val="20"/>
+          <w:szCs w:val="20"/>
+        </w:rPr>
+        <w:t xml:space="preserve"> (documentar qué hace este módulo)</w:t>
       </w:r>
     </w:p>
     <w:p>
@@ -3191,16 +3227,16 @@
           <w:sz w:val="20"/>
           <w:szCs w:val="20"/>
         </w:rPr>
-        <w:t xml:space="preserve"> — rangos de memoria asignados a dispositivos (memory-</w:t>
-      </w:r>
-      <w:proofErr w:type="spellStart"/>
-      <w:r>
-        <w:rPr>
-          <w:rFonts w:ascii="Arial" w:eastAsia="Arial" w:hAnsi="Arial" w:cs="Arial"/>
-          <w:sz w:val="20"/>
-          <w:szCs w:val="20"/>
-        </w:rPr>
-        <w:t>mapped</w:t>
+        <w:t xml:space="preserve"> — rangos de memoria asignados a dispositivos (</w:t>
+      </w:r>
+      <w:proofErr w:type="spellStart"/>
+      <w:r>
+        <w:rPr>
+          <w:rFonts w:ascii="Arial" w:eastAsia="Arial" w:hAnsi="Arial" w:cs="Arial"/>
+          <w:sz w:val="20"/>
+          <w:szCs w:val="20"/>
+        </w:rPr>
+        <w:t>memory-mapped</w:t>
       </w:r>
       <w:proofErr w:type="spellEnd"/>
       <w:r>
@@ -5453,25 +5489,7 @@
           <w:sz w:val="20"/>
           <w:szCs w:val="20"/>
         </w:rPr>
-        <w:t xml:space="preserve"> </w:t>
-      </w:r>
-      <w:proofErr w:type="spellStart"/>
-      <w:r>
-        <w:rPr>
-          <w:rFonts w:ascii="Arial" w:hAnsi="Arial" w:cs="Arial"/>
-          <w:sz w:val="20"/>
-          <w:szCs w:val="20"/>
-        </w:rPr>
-        <w:t>Number</w:t>
-      </w:r>
-      <w:proofErr w:type="spellEnd"/>
-      <w:r>
-        <w:rPr>
-          <w:rFonts w:ascii="Arial" w:hAnsi="Arial" w:cs="Arial"/>
-          <w:sz w:val="20"/>
-          <w:szCs w:val="20"/>
-        </w:rPr>
-        <w:t xml:space="preserve"> de cada uno, que es el identificador numérico que usa el kernel para asociar los archivos especiales en /</w:t>
+        <w:t xml:space="preserve"> Number de cada uno, que es el identificador numérico que usa el kernel para asociar los archivos especiales en /</w:t>
       </w:r>
       <w:proofErr w:type="spellStart"/>
       <w:r>
@@ -6154,7 +6172,25 @@
           <w:sz w:val="20"/>
           <w:szCs w:val="20"/>
         </w:rPr>
-        <w:t>Usar MODULE_AUTHOR("[nombre completo]"), MODULE_DESCRIPTION y MODULE_LICENSE("GPL")</w:t>
+        <w:t>Usar MODULE_</w:t>
+      </w:r>
+      <w:proofErr w:type="gramStart"/>
+      <w:r>
+        <w:rPr>
+          <w:rFonts w:ascii="Arial" w:eastAsia="Arial" w:hAnsi="Arial" w:cs="Arial"/>
+          <w:sz w:val="20"/>
+          <w:szCs w:val="20"/>
+        </w:rPr>
+        <w:t>AUTHOR(</w:t>
+      </w:r>
+      <w:proofErr w:type="gramEnd"/>
+      <w:r>
+        <w:rPr>
+          <w:rFonts w:ascii="Arial" w:eastAsia="Arial" w:hAnsi="Arial" w:cs="Arial"/>
+          <w:sz w:val="20"/>
+          <w:szCs w:val="20"/>
+        </w:rPr>
+        <w:t>"[nombre completo]"), MODULE_DESCRIPTION y MODULE_LICENSE("GPL")</w:t>
       </w:r>
     </w:p>
     <w:p>
@@ -6197,7 +6233,25 @@
           <w:sz w:val="20"/>
           <w:szCs w:val="20"/>
         </w:rPr>
-        <w:t xml:space="preserve"> debe imprimir con printk(KERN_INFO, ...) datos reales del subsistema asignado</w:t>
+        <w:t xml:space="preserve"> debe imprimir con </w:t>
+      </w:r>
+      <w:proofErr w:type="gramStart"/>
+      <w:r>
+        <w:rPr>
+          <w:rFonts w:ascii="Arial" w:eastAsia="Arial" w:hAnsi="Arial" w:cs="Arial"/>
+          <w:sz w:val="20"/>
+          <w:szCs w:val="20"/>
+        </w:rPr>
+        <w:t>printk(</w:t>
+      </w:r>
+      <w:proofErr w:type="gramEnd"/>
+      <w:r>
+        <w:rPr>
+          <w:rFonts w:ascii="Arial" w:eastAsia="Arial" w:hAnsi="Arial" w:cs="Arial"/>
+          <w:sz w:val="20"/>
+          <w:szCs w:val="20"/>
+        </w:rPr>
+        <w:t>KERN_INFO, ...) datos reales del subsistema asignado</w:t>
       </w:r>
     </w:p>
     <w:p>
@@ -6301,7 +6355,25 @@
           <w:sz w:val="20"/>
           <w:szCs w:val="20"/>
         </w:rPr>
-        <w:t xml:space="preserve"> y descarga con rmmod + </w:t>
+        <w:t xml:space="preserve"> y descarga con </w:t>
+      </w:r>
+      <w:proofErr w:type="spellStart"/>
+      <w:r>
+        <w:rPr>
+          <w:rFonts w:ascii="Arial" w:eastAsia="Arial" w:hAnsi="Arial" w:cs="Arial"/>
+          <w:sz w:val="20"/>
+          <w:szCs w:val="20"/>
+        </w:rPr>
+        <w:t>rmmod</w:t>
+      </w:r>
+      <w:proofErr w:type="spellEnd"/>
+      <w:r>
+        <w:rPr>
+          <w:rFonts w:ascii="Arial" w:eastAsia="Arial" w:hAnsi="Arial" w:cs="Arial"/>
+          <w:sz w:val="20"/>
+          <w:szCs w:val="20"/>
+        </w:rPr>
+        <w:t xml:space="preserve"> + </w:t>
       </w:r>
       <w:proofErr w:type="spellStart"/>
       <w:r>
@@ -6475,8 +6547,39 @@
                 <w:sz w:val="20"/>
                 <w:szCs w:val="20"/>
               </w:rPr>
-              <w:t># 2. Crear Makefile con: obj-m := nombre_modulo.o</w:t>
+              <w:t># 2. Crear Makefile con: obj-</w:t>
             </w:r>
+            <w:proofErr w:type="gramStart"/>
+            <w:r>
+              <w:rPr>
+                <w:rFonts w:ascii="Arial" w:eastAsia="Courier New" w:hAnsi="Arial" w:cs="Arial"/>
+                <w:color w:val="6A9955"/>
+                <w:sz w:val="20"/>
+                <w:szCs w:val="20"/>
+              </w:rPr>
+              <w:t>m :</w:t>
+            </w:r>
+            <w:proofErr w:type="gramEnd"/>
+            <w:r>
+              <w:rPr>
+                <w:rFonts w:ascii="Arial" w:eastAsia="Courier New" w:hAnsi="Arial" w:cs="Arial"/>
+                <w:color w:val="6A9955"/>
+                <w:sz w:val="20"/>
+                <w:szCs w:val="20"/>
+              </w:rPr>
+              <w:t>= nombre_</w:t>
+            </w:r>
+            <w:proofErr w:type="gramStart"/>
+            <w:r>
+              <w:rPr>
+                <w:rFonts w:ascii="Arial" w:eastAsia="Courier New" w:hAnsi="Arial" w:cs="Arial"/>
+                <w:color w:val="6A9955"/>
+                <w:sz w:val="20"/>
+                <w:szCs w:val="20"/>
+              </w:rPr>
+              <w:t>modulo.o</w:t>
+            </w:r>
+            <w:proofErr w:type="gramEnd"/>
           </w:p>
           <w:p>
             <w:pPr>
@@ -6641,9 +6744,20 @@
                 <w:sz w:val="20"/>
                 <w:szCs w:val="20"/>
               </w:rPr>
-              <w:t>nombre_modulo.ko</w:t>
+              <w:t>nombre_</w:t>
+            </w:r>
+            <w:proofErr w:type="gramStart"/>
+            <w:r>
+              <w:rPr>
+                <w:rFonts w:ascii="Arial" w:eastAsia="Courier New" w:hAnsi="Arial" w:cs="Arial"/>
+                <w:color w:val="9CDCFE"/>
+                <w:sz w:val="20"/>
+                <w:szCs w:val="20"/>
+              </w:rPr>
+              <w:t>modulo.ko</w:t>
             </w:r>
             <w:proofErr w:type="spellEnd"/>
+            <w:proofErr w:type="gramEnd"/>
             <w:r>
               <w:rPr>
                 <w:rFonts w:ascii="Arial" w:eastAsia="Courier New" w:hAnsi="Arial" w:cs="Arial"/>
@@ -6801,7 +6915,27 @@
                 <w:sz w:val="20"/>
                 <w:szCs w:val="20"/>
               </w:rPr>
-              <w:t xml:space="preserve">sudo rmmod </w:t>
+              <w:t xml:space="preserve">sudo </w:t>
+            </w:r>
+            <w:proofErr w:type="spellStart"/>
+            <w:r>
+              <w:rPr>
+                <w:rFonts w:ascii="Arial" w:eastAsia="Courier New" w:hAnsi="Arial" w:cs="Arial"/>
+                <w:color w:val="9CDCFE"/>
+                <w:sz w:val="20"/>
+                <w:szCs w:val="20"/>
+              </w:rPr>
+              <w:t>rmmod</w:t>
+            </w:r>
+            <w:proofErr w:type="spellEnd"/>
+            <w:r>
+              <w:rPr>
+                <w:rFonts w:ascii="Arial" w:eastAsia="Courier New" w:hAnsi="Arial" w:cs="Arial"/>
+                <w:color w:val="9CDCFE"/>
+                <w:sz w:val="20"/>
+                <w:szCs w:val="20"/>
+              </w:rPr>
+              <w:t xml:space="preserve"> </w:t>
             </w:r>
             <w:proofErr w:type="spellStart"/>
             <w:r>
@@ -7466,6 +7600,7 @@
           <w:szCs w:val="20"/>
         </w:rPr>
       </w:pPr>
+      <w:proofErr w:type="spellStart"/>
       <w:r>
         <w:rPr>
           <w:rFonts w:ascii="Arial" w:hAnsi="Arial" w:cs="Arial"/>
@@ -7473,7 +7608,16 @@
           <w:szCs w:val="20"/>
         </w:rPr>
         <w:lastRenderedPageBreak/>
-        <w:t xml:space="preserve">Makefile, </w:t>
+        <w:t>Makefile</w:t>
+      </w:r>
+      <w:proofErr w:type="spellEnd"/>
+      <w:r>
+        <w:rPr>
+          <w:rFonts w:ascii="Arial" w:hAnsi="Arial" w:cs="Arial"/>
+          <w:sz w:val="20"/>
+          <w:szCs w:val="20"/>
+        </w:rPr>
+        <w:t xml:space="preserve">, </w:t>
       </w:r>
       <w:proofErr w:type="spellStart"/>
       <w:r>
@@ -7931,8 +8075,45 @@
           <w:sz w:val="18"/>
           <w:szCs w:val="18"/>
         </w:rPr>
-        <w:t>2. Crear Makefile con: obj-m := nombre_modulo.o</w:t>
-      </w:r>
+        <w:t>2. Crear Makefile con: obj-</w:t>
+      </w:r>
+      <w:proofErr w:type="gramStart"/>
+      <w:r>
+        <w:rPr>
+          <w:rFonts w:ascii="Courier New" w:eastAsia="Courier New" w:hAnsi="Courier New" w:cs="Courier New"/>
+          <w:b/>
+          <w:bCs/>
+          <w:color w:val="6A9955"/>
+          <w:sz w:val="18"/>
+          <w:szCs w:val="18"/>
+        </w:rPr>
+        <w:t>m :</w:t>
+      </w:r>
+      <w:proofErr w:type="gramEnd"/>
+      <w:r>
+        <w:rPr>
+          <w:rFonts w:ascii="Courier New" w:eastAsia="Courier New" w:hAnsi="Courier New" w:cs="Courier New"/>
+          <w:b/>
+          <w:bCs/>
+          <w:color w:val="6A9955"/>
+          <w:sz w:val="18"/>
+          <w:szCs w:val="18"/>
+        </w:rPr>
+        <w:t>= nombre_</w:t>
+      </w:r>
+      <w:proofErr w:type="gramStart"/>
+      <w:r>
+        <w:rPr>
+          <w:rFonts w:ascii="Courier New" w:eastAsia="Courier New" w:hAnsi="Courier New" w:cs="Courier New"/>
+          <w:b/>
+          <w:bCs/>
+          <w:color w:val="6A9955"/>
+          <w:sz w:val="18"/>
+          <w:szCs w:val="18"/>
+        </w:rPr>
+        <w:t>modulo.o</w:t>
+      </w:r>
+      <w:proofErr w:type="gramEnd"/>
     </w:p>
     <w:p>
       <w:r>
@@ -8229,9 +8410,22 @@
           <w:sz w:val="18"/>
           <w:szCs w:val="18"/>
         </w:rPr>
-        <w:t>nombre_modulo.ko</w:t>
-      </w:r>
-      <w:proofErr w:type="spellEnd"/>
+        <w:t>nombre_</w:t>
+      </w:r>
+      <w:proofErr w:type="gramStart"/>
+      <w:r>
+        <w:rPr>
+          <w:rFonts w:ascii="Courier New" w:eastAsia="Courier New" w:hAnsi="Courier New" w:cs="Courier New"/>
+          <w:b/>
+          <w:bCs/>
+          <w:color w:val="9CDCFE"/>
+          <w:sz w:val="18"/>
+          <w:szCs w:val="18"/>
+        </w:rPr>
+        <w:t>modulo.ko</w:t>
+      </w:r>
+      <w:proofErr w:type="spellEnd"/>
+      <w:proofErr w:type="gramEnd"/>
       <w:r>
         <w:rPr>
           <w:rFonts w:ascii="Courier New" w:eastAsia="Courier New" w:hAnsi="Courier New" w:cs="Courier New"/>
@@ -8536,7 +8730,31 @@
           <w:sz w:val="18"/>
           <w:szCs w:val="18"/>
         </w:rPr>
-        <w:t xml:space="preserve">sudo rmmod </w:t>
+        <w:t xml:space="preserve">sudo </w:t>
+      </w:r>
+      <w:proofErr w:type="spellStart"/>
+      <w:r>
+        <w:rPr>
+          <w:rFonts w:ascii="Courier New" w:eastAsia="Courier New" w:hAnsi="Courier New" w:cs="Courier New"/>
+          <w:b/>
+          <w:bCs/>
+          <w:color w:val="9CDCFE"/>
+          <w:sz w:val="18"/>
+          <w:szCs w:val="18"/>
+        </w:rPr>
+        <w:t>rmmod</w:t>
+      </w:r>
+      <w:proofErr w:type="spellEnd"/>
+      <w:r>
+        <w:rPr>
+          <w:rFonts w:ascii="Courier New" w:eastAsia="Courier New" w:hAnsi="Courier New" w:cs="Courier New"/>
+          <w:b/>
+          <w:bCs/>
+          <w:color w:val="9CDCFE"/>
+          <w:sz w:val="18"/>
+          <w:szCs w:val="18"/>
+        </w:rPr>
+        <w:t xml:space="preserve"> </w:t>
       </w:r>
       <w:proofErr w:type="spellStart"/>
       <w:r>
@@ -8732,6 +8950,684 @@
           <w:bCs/>
           <w:color w:val="B03A2E"/>
         </w:rPr>
+        <w:t xml:space="preserve">D. Emulación vs </w:t>
+      </w:r>
+      <w:proofErr w:type="spellStart"/>
+      <w:r>
+        <w:rPr>
+          <w:rFonts w:ascii="Arial" w:eastAsia="Arial" w:hAnsi="Arial" w:cs="Arial"/>
+          <w:b/>
+          <w:bCs/>
+          <w:color w:val="B03A2E"/>
+        </w:rPr>
+        <w:t>Paravirtualización</w:t>
+      </w:r>
+      <w:proofErr w:type="spellEnd"/>
+      <w:r>
+        <w:rPr>
+          <w:rFonts w:ascii="Arial" w:eastAsia="Arial" w:hAnsi="Arial" w:cs="Arial"/>
+          <w:b/>
+          <w:bCs/>
+          <w:color w:val="B03A2E"/>
+        </w:rPr>
+        <w:t xml:space="preserve"> en VirtualBox (Temas 6.1 y 6.2)</w:t>
+      </w:r>
+    </w:p>
+    <w:p>
+      <w:pPr>
+        <w:pStyle w:val="Prrafodelista"/>
+        <w:numPr>
+          <w:ilvl w:val="0"/>
+          <w:numId w:val="8"/>
+        </w:numPr>
+        <w:spacing w:before="60" w:after="60" w:line="240" w:lineRule="auto"/>
+        <w:contextualSpacing w:val="0"/>
+      </w:pPr>
+      <w:r>
+        <w:rPr>
+          <w:rFonts w:ascii="Arial" w:eastAsia="Arial" w:hAnsi="Arial" w:cs="Arial"/>
+          <w:sz w:val="22"/>
+          <w:szCs w:val="22"/>
+        </w:rPr>
+        <w:t xml:space="preserve">Ejecutar </w:t>
+      </w:r>
+      <w:proofErr w:type="spellStart"/>
+      <w:r>
+        <w:rPr>
+          <w:rFonts w:ascii="Arial" w:eastAsia="Arial" w:hAnsi="Arial" w:cs="Arial"/>
+          <w:sz w:val="22"/>
+          <w:szCs w:val="22"/>
+        </w:rPr>
+        <w:t>lspci</w:t>
+      </w:r>
+      <w:proofErr w:type="spellEnd"/>
+      <w:r>
+        <w:rPr>
+          <w:rFonts w:ascii="Arial" w:eastAsia="Arial" w:hAnsi="Arial" w:cs="Arial"/>
+          <w:sz w:val="22"/>
+          <w:szCs w:val="22"/>
+        </w:rPr>
+        <w:t xml:space="preserve"> -v dentro de la VM e identificar qué dispositivos muestran </w:t>
+      </w:r>
+      <w:proofErr w:type="spellStart"/>
+      <w:r>
+        <w:rPr>
+          <w:rFonts w:ascii="Arial" w:eastAsia="Arial" w:hAnsi="Arial" w:cs="Arial"/>
+          <w:sz w:val="22"/>
+          <w:szCs w:val="22"/>
+        </w:rPr>
+        <w:t>vendor</w:t>
+      </w:r>
+      <w:proofErr w:type="spellEnd"/>
+      <w:r>
+        <w:rPr>
+          <w:rFonts w:ascii="Arial" w:eastAsia="Arial" w:hAnsi="Arial" w:cs="Arial"/>
+          <w:sz w:val="22"/>
+          <w:szCs w:val="22"/>
+        </w:rPr>
+        <w:t xml:space="preserve"> '</w:t>
+      </w:r>
+      <w:proofErr w:type="spellStart"/>
+      <w:r>
+        <w:rPr>
+          <w:rFonts w:ascii="Arial" w:eastAsia="Arial" w:hAnsi="Arial" w:cs="Arial"/>
+          <w:sz w:val="22"/>
+          <w:szCs w:val="22"/>
+        </w:rPr>
+        <w:t>InnoTek</w:t>
+      </w:r>
+      <w:proofErr w:type="spellEnd"/>
+      <w:r>
+        <w:rPr>
+          <w:rFonts w:ascii="Arial" w:eastAsia="Arial" w:hAnsi="Arial" w:cs="Arial"/>
+          <w:sz w:val="22"/>
+          <w:szCs w:val="22"/>
+        </w:rPr>
+        <w:t>'/'Oracle' (emulados) y cuáles son '</w:t>
+      </w:r>
+      <w:proofErr w:type="spellStart"/>
+      <w:r>
+        <w:rPr>
+          <w:rFonts w:ascii="Arial" w:eastAsia="Arial" w:hAnsi="Arial" w:cs="Arial"/>
+          <w:sz w:val="22"/>
+          <w:szCs w:val="22"/>
+        </w:rPr>
+        <w:t>VirtIO</w:t>
+      </w:r>
+      <w:proofErr w:type="spellEnd"/>
+      <w:r>
+        <w:rPr>
+          <w:rFonts w:ascii="Arial" w:eastAsia="Arial" w:hAnsi="Arial" w:cs="Arial"/>
+          <w:sz w:val="22"/>
+          <w:szCs w:val="22"/>
+        </w:rPr>
+        <w:t>' (</w:t>
+      </w:r>
+      <w:proofErr w:type="spellStart"/>
+      <w:r>
+        <w:rPr>
+          <w:rFonts w:ascii="Arial" w:eastAsia="Arial" w:hAnsi="Arial" w:cs="Arial"/>
+          <w:sz w:val="22"/>
+          <w:szCs w:val="22"/>
+        </w:rPr>
+        <w:t>paravirtualizados</w:t>
+      </w:r>
+      <w:proofErr w:type="spellEnd"/>
+      <w:r>
+        <w:rPr>
+          <w:rFonts w:ascii="Arial" w:eastAsia="Arial" w:hAnsi="Arial" w:cs="Arial"/>
+          <w:sz w:val="22"/>
+          <w:szCs w:val="22"/>
+        </w:rPr>
+        <w:t>)</w:t>
+      </w:r>
+    </w:p>
+    <w:p>
+      <w:r>
+        <w:rPr>
+          <w:noProof/>
+        </w:rPr>
+        <w:lastRenderedPageBreak/>
+        <w:drawing>
+          <wp:inline distT="0" distB="0" distL="0" distR="0" wp14:anchorId="207B9C62" wp14:editId="4FAC9EE4">
+            <wp:extent cx="5612130" cy="2823845"/>
+            <wp:effectExtent l="0" t="0" r="7620" b="0"/>
+            <wp:docPr id="1969071285" name="Imagen 1"/>
+            <wp:cNvGraphicFramePr>
+              <a:graphicFrameLocks xmlns:a="http://schemas.openxmlformats.org/drawingml/2006/main" noChangeAspect="1"/>
+            </wp:cNvGraphicFramePr>
+            <a:graphic xmlns:a="http://schemas.openxmlformats.org/drawingml/2006/main">
+              <a:graphicData uri="http://schemas.openxmlformats.org/drawingml/2006/picture">
+                <pic:pic xmlns:pic="http://schemas.openxmlformats.org/drawingml/2006/picture">
+                  <pic:nvPicPr>
+                    <pic:cNvPr id="0" name="Picture 1"/>
+                    <pic:cNvPicPr>
+                      <a:picLocks noChangeAspect="1" noChangeArrowheads="1"/>
+                    </pic:cNvPicPr>
+                  </pic:nvPicPr>
+                  <pic:blipFill>
+                    <a:blip r:embed="rId45">
+                      <a:extLst>
+                        <a:ext uri="{28A0092B-C50C-407E-A947-70E740481C1C}">
+                          <a14:useLocalDpi xmlns:a14="http://schemas.microsoft.com/office/drawing/2010/main" val="0"/>
+                        </a:ext>
+                      </a:extLst>
+                    </a:blip>
+                    <a:srcRect/>
+                    <a:stretch>
+                      <a:fillRect/>
+                    </a:stretch>
+                  </pic:blipFill>
+                  <pic:spPr bwMode="auto">
+                    <a:xfrm>
+                      <a:off x="0" y="0"/>
+                      <a:ext cx="5612130" cy="2823845"/>
+                    </a:xfrm>
+                    <a:prstGeom prst="rect">
+                      <a:avLst/>
+                    </a:prstGeom>
+                    <a:noFill/>
+                    <a:ln>
+                      <a:noFill/>
+                    </a:ln>
+                  </pic:spPr>
+                </pic:pic>
+              </a:graphicData>
+            </a:graphic>
+          </wp:inline>
+        </w:drawing>
+      </w:r>
+      <w:r>
+        <w:t xml:space="preserve"> </w:t>
+      </w:r>
+      <w:r>
+        <w:rPr>
+          <w:noProof/>
+        </w:rPr>
+        <w:drawing>
+          <wp:inline distT="0" distB="0" distL="0" distR="0" wp14:anchorId="3FE7A0E3" wp14:editId="12DF0053">
+            <wp:extent cx="5612130" cy="2502535"/>
+            <wp:effectExtent l="0" t="0" r="7620" b="0"/>
+            <wp:docPr id="2030203806" name="Imagen 2"/>
+            <wp:cNvGraphicFramePr>
+              <a:graphicFrameLocks xmlns:a="http://schemas.openxmlformats.org/drawingml/2006/main" noChangeAspect="1"/>
+            </wp:cNvGraphicFramePr>
+            <a:graphic xmlns:a="http://schemas.openxmlformats.org/drawingml/2006/main">
+              <a:graphicData uri="http://schemas.openxmlformats.org/drawingml/2006/picture">
+                <pic:pic xmlns:pic="http://schemas.openxmlformats.org/drawingml/2006/picture">
+                  <pic:nvPicPr>
+                    <pic:cNvPr id="0" name="Picture 3"/>
+                    <pic:cNvPicPr>
+                      <a:picLocks noChangeAspect="1" noChangeArrowheads="1"/>
+                    </pic:cNvPicPr>
+                  </pic:nvPicPr>
+                  <pic:blipFill>
+                    <a:blip r:embed="rId46">
+                      <a:extLst>
+                        <a:ext uri="{28A0092B-C50C-407E-A947-70E740481C1C}">
+                          <a14:useLocalDpi xmlns:a14="http://schemas.microsoft.com/office/drawing/2010/main" val="0"/>
+                        </a:ext>
+                      </a:extLst>
+                    </a:blip>
+                    <a:srcRect/>
+                    <a:stretch>
+                      <a:fillRect/>
+                    </a:stretch>
+                  </pic:blipFill>
+                  <pic:spPr bwMode="auto">
+                    <a:xfrm>
+                      <a:off x="0" y="0"/>
+                      <a:ext cx="5612130" cy="2502535"/>
+                    </a:xfrm>
+                    <a:prstGeom prst="rect">
+                      <a:avLst/>
+                    </a:prstGeom>
+                    <a:noFill/>
+                    <a:ln>
+                      <a:noFill/>
+                    </a:ln>
+                  </pic:spPr>
+                </pic:pic>
+              </a:graphicData>
+            </a:graphic>
+          </wp:inline>
+        </w:drawing>
+      </w:r>
+      <w:r>
+        <w:t xml:space="preserve"> </w:t>
+      </w:r>
+      <w:r>
+        <w:rPr>
+          <w:noProof/>
+        </w:rPr>
+        <w:lastRenderedPageBreak/>
+        <w:drawing>
+          <wp:inline distT="0" distB="0" distL="0" distR="0" wp14:anchorId="75BF877B" wp14:editId="3195A03F">
+            <wp:extent cx="5612130" cy="2495550"/>
+            <wp:effectExtent l="0" t="0" r="7620" b="0"/>
+            <wp:docPr id="1978867767" name="Imagen 3"/>
+            <wp:cNvGraphicFramePr>
+              <a:graphicFrameLocks xmlns:a="http://schemas.openxmlformats.org/drawingml/2006/main" noChangeAspect="1"/>
+            </wp:cNvGraphicFramePr>
+            <a:graphic xmlns:a="http://schemas.openxmlformats.org/drawingml/2006/main">
+              <a:graphicData uri="http://schemas.openxmlformats.org/drawingml/2006/picture">
+                <pic:pic xmlns:pic="http://schemas.openxmlformats.org/drawingml/2006/picture">
+                  <pic:nvPicPr>
+                    <pic:cNvPr id="0" name="Picture 5"/>
+                    <pic:cNvPicPr>
+                      <a:picLocks noChangeAspect="1" noChangeArrowheads="1"/>
+                    </pic:cNvPicPr>
+                  </pic:nvPicPr>
+                  <pic:blipFill>
+                    <a:blip r:embed="rId47">
+                      <a:extLst>
+                        <a:ext uri="{28A0092B-C50C-407E-A947-70E740481C1C}">
+                          <a14:useLocalDpi xmlns:a14="http://schemas.microsoft.com/office/drawing/2010/main" val="0"/>
+                        </a:ext>
+                      </a:extLst>
+                    </a:blip>
+                    <a:srcRect/>
+                    <a:stretch>
+                      <a:fillRect/>
+                    </a:stretch>
+                  </pic:blipFill>
+                  <pic:spPr bwMode="auto">
+                    <a:xfrm>
+                      <a:off x="0" y="0"/>
+                      <a:ext cx="5612130" cy="2495550"/>
+                    </a:xfrm>
+                    <a:prstGeom prst="rect">
+                      <a:avLst/>
+                    </a:prstGeom>
+                    <a:noFill/>
+                    <a:ln>
+                      <a:noFill/>
+                    </a:ln>
+                  </pic:spPr>
+                </pic:pic>
+              </a:graphicData>
+            </a:graphic>
+          </wp:inline>
+        </w:drawing>
+      </w:r>
+      <w:r>
+        <w:t xml:space="preserve"> </w:t>
+      </w:r>
+      <w:r>
+        <w:rPr>
+          <w:noProof/>
+        </w:rPr>
+        <w:drawing>
+          <wp:inline distT="0" distB="0" distL="0" distR="0" wp14:anchorId="53A519F3" wp14:editId="42EFA48C">
+            <wp:extent cx="5612130" cy="2812415"/>
+            <wp:effectExtent l="0" t="0" r="7620" b="6985"/>
+            <wp:docPr id="1646418481" name="Imagen 4"/>
+            <wp:cNvGraphicFramePr>
+              <a:graphicFrameLocks xmlns:a="http://schemas.openxmlformats.org/drawingml/2006/main" noChangeAspect="1"/>
+            </wp:cNvGraphicFramePr>
+            <a:graphic xmlns:a="http://schemas.openxmlformats.org/drawingml/2006/main">
+              <a:graphicData uri="http://schemas.openxmlformats.org/drawingml/2006/picture">
+                <pic:pic xmlns:pic="http://schemas.openxmlformats.org/drawingml/2006/picture">
+                  <pic:nvPicPr>
+                    <pic:cNvPr id="0" name="Picture 7"/>
+                    <pic:cNvPicPr>
+                      <a:picLocks noChangeAspect="1" noChangeArrowheads="1"/>
+                    </pic:cNvPicPr>
+                  </pic:nvPicPr>
+                  <pic:blipFill>
+                    <a:blip r:embed="rId48">
+                      <a:extLst>
+                        <a:ext uri="{28A0092B-C50C-407E-A947-70E740481C1C}">
+                          <a14:useLocalDpi xmlns:a14="http://schemas.microsoft.com/office/drawing/2010/main" val="0"/>
+                        </a:ext>
+                      </a:extLst>
+                    </a:blip>
+                    <a:srcRect/>
+                    <a:stretch>
+                      <a:fillRect/>
+                    </a:stretch>
+                  </pic:blipFill>
+                  <pic:spPr bwMode="auto">
+                    <a:xfrm>
+                      <a:off x="0" y="0"/>
+                      <a:ext cx="5612130" cy="2812415"/>
+                    </a:xfrm>
+                    <a:prstGeom prst="rect">
+                      <a:avLst/>
+                    </a:prstGeom>
+                    <a:noFill/>
+                    <a:ln>
+                      <a:noFill/>
+                    </a:ln>
+                  </pic:spPr>
+                </pic:pic>
+              </a:graphicData>
+            </a:graphic>
+          </wp:inline>
+        </w:drawing>
+      </w:r>
+    </w:p>
+    <w:p>
+      <w:r>
+        <w:t>Dispositivos identificados</w:t>
+      </w:r>
+    </w:p>
+    <w:p>
+      <w:r>
+        <w:drawing>
+          <wp:inline distT="0" distB="0" distL="0" distR="0" wp14:anchorId="63D26C53" wp14:editId="1BF51F6A">
+            <wp:extent cx="5612130" cy="1012825"/>
+            <wp:effectExtent l="0" t="0" r="7620" b="0"/>
+            <wp:docPr id="1753952190" name="Imagen 8"/>
+            <wp:cNvGraphicFramePr>
+              <a:graphicFrameLocks xmlns:a="http://schemas.openxmlformats.org/drawingml/2006/main" noChangeAspect="1"/>
+            </wp:cNvGraphicFramePr>
+            <a:graphic xmlns:a="http://schemas.openxmlformats.org/drawingml/2006/main">
+              <a:graphicData uri="http://schemas.openxmlformats.org/drawingml/2006/picture">
+                <pic:pic xmlns:pic="http://schemas.openxmlformats.org/drawingml/2006/picture">
+                  <pic:nvPicPr>
+                    <pic:cNvPr id="0" name="Picture 21"/>
+                    <pic:cNvPicPr>
+                      <a:picLocks noChangeAspect="1" noChangeArrowheads="1"/>
+                    </pic:cNvPicPr>
+                  </pic:nvPicPr>
+                  <pic:blipFill>
+                    <a:blip r:embed="rId49">
+                      <a:extLst>
+                        <a:ext uri="{28A0092B-C50C-407E-A947-70E740481C1C}">
+                          <a14:useLocalDpi xmlns:a14="http://schemas.microsoft.com/office/drawing/2010/main" val="0"/>
+                        </a:ext>
+                      </a:extLst>
+                    </a:blip>
+                    <a:srcRect/>
+                    <a:stretch>
+                      <a:fillRect/>
+                    </a:stretch>
+                  </pic:blipFill>
+                  <pic:spPr bwMode="auto">
+                    <a:xfrm>
+                      <a:off x="0" y="0"/>
+                      <a:ext cx="5612130" cy="1012825"/>
+                    </a:xfrm>
+                    <a:prstGeom prst="rect">
+                      <a:avLst/>
+                    </a:prstGeom>
+                    <a:noFill/>
+                    <a:ln>
+                      <a:noFill/>
+                    </a:ln>
+                  </pic:spPr>
+                </pic:pic>
+              </a:graphicData>
+            </a:graphic>
+          </wp:inline>
+        </w:drawing>
+      </w:r>
+    </w:p>
+    <w:p>
+      <w:pPr>
+        <w:pStyle w:val="Prrafodelista"/>
+        <w:numPr>
+          <w:ilvl w:val="0"/>
+          <w:numId w:val="11"/>
+        </w:numPr>
+        <w:spacing w:before="60" w:after="60" w:line="240" w:lineRule="auto"/>
+      </w:pPr>
+      <w:r>
+        <w:rPr>
+          <w:rFonts w:ascii="Arial" w:eastAsia="Arial" w:hAnsi="Arial" w:cs="Arial"/>
+          <w:sz w:val="22"/>
+          <w:szCs w:val="22"/>
+        </w:rPr>
+        <w:t xml:space="preserve">Para cada dispositivo </w:t>
+      </w:r>
+      <w:proofErr w:type="spellStart"/>
+      <w:r>
+        <w:rPr>
+          <w:rFonts w:ascii="Arial" w:eastAsia="Arial" w:hAnsi="Arial" w:cs="Arial"/>
+          <w:sz w:val="22"/>
+          <w:szCs w:val="22"/>
+        </w:rPr>
+        <w:t>VirtIO</w:t>
+      </w:r>
+      <w:proofErr w:type="spellEnd"/>
+      <w:r>
+        <w:rPr>
+          <w:rFonts w:ascii="Arial" w:eastAsia="Arial" w:hAnsi="Arial" w:cs="Arial"/>
+          <w:sz w:val="22"/>
+          <w:szCs w:val="22"/>
+        </w:rPr>
+        <w:t xml:space="preserve"> identificado, ejecutar </w:t>
+      </w:r>
+      <w:proofErr w:type="spellStart"/>
+      <w:r>
+        <w:rPr>
+          <w:rFonts w:ascii="Arial" w:eastAsia="Arial" w:hAnsi="Arial" w:cs="Arial"/>
+          <w:sz w:val="22"/>
+          <w:szCs w:val="22"/>
+        </w:rPr>
+        <w:t>lsmod</w:t>
+      </w:r>
+      <w:proofErr w:type="spellEnd"/>
+      <w:r>
+        <w:rPr>
+          <w:rFonts w:ascii="Arial" w:eastAsia="Arial" w:hAnsi="Arial" w:cs="Arial"/>
+          <w:sz w:val="22"/>
+          <w:szCs w:val="22"/>
+        </w:rPr>
+        <w:t xml:space="preserve"> | grep </w:t>
+      </w:r>
+      <w:proofErr w:type="spellStart"/>
+      <w:r>
+        <w:rPr>
+          <w:rFonts w:ascii="Arial" w:eastAsia="Arial" w:hAnsi="Arial" w:cs="Arial"/>
+          <w:sz w:val="22"/>
+          <w:szCs w:val="22"/>
+        </w:rPr>
+        <w:t>virtio</w:t>
+      </w:r>
+      <w:proofErr w:type="spellEnd"/>
+      <w:r>
+        <w:rPr>
+          <w:rFonts w:ascii="Arial" w:eastAsia="Arial" w:hAnsi="Arial" w:cs="Arial"/>
+          <w:sz w:val="22"/>
+          <w:szCs w:val="22"/>
+        </w:rPr>
+        <w:t xml:space="preserve"> y </w:t>
+      </w:r>
+      <w:proofErr w:type="spellStart"/>
+      <w:r>
+        <w:rPr>
+          <w:rFonts w:ascii="Arial" w:eastAsia="Arial" w:hAnsi="Arial" w:cs="Arial"/>
+          <w:sz w:val="22"/>
+          <w:szCs w:val="22"/>
+        </w:rPr>
+        <w:t>modinfo</w:t>
+      </w:r>
+      <w:proofErr w:type="spellEnd"/>
+      <w:r>
+        <w:rPr>
+          <w:rFonts w:ascii="Arial" w:eastAsia="Arial" w:hAnsi="Arial" w:cs="Arial"/>
+          <w:sz w:val="22"/>
+          <w:szCs w:val="22"/>
+        </w:rPr>
+        <w:t xml:space="preserve"> del módulo correspondiente</w:t>
+      </w:r>
+    </w:p>
+    <w:p>
+      <w:pPr>
+        <w:pStyle w:val="Prrafodelista"/>
+        <w:numPr>
+          <w:ilvl w:val="0"/>
+          <w:numId w:val="11"/>
+        </w:numPr>
+        <w:spacing w:before="60" w:after="60" w:line="240" w:lineRule="auto"/>
+      </w:pPr>
+      <w:r>
+        <w:rPr>
+          <w:rFonts w:ascii="Arial" w:eastAsia="Arial" w:hAnsi="Arial" w:cs="Arial"/>
+          <w:sz w:val="22"/>
+          <w:szCs w:val="22"/>
+        </w:rPr>
+        <w:t xml:space="preserve">Comparar en </w:t>
+      </w:r>
+      <w:proofErr w:type="spellStart"/>
+      <w:r>
+        <w:rPr>
+          <w:rFonts w:ascii="Arial" w:eastAsia="Arial" w:hAnsi="Arial" w:cs="Arial"/>
+          <w:sz w:val="22"/>
+          <w:szCs w:val="22"/>
+        </w:rPr>
+        <w:t>dmesg</w:t>
+      </w:r>
+      <w:proofErr w:type="spellEnd"/>
+      <w:r>
+        <w:rPr>
+          <w:rFonts w:ascii="Arial" w:eastAsia="Arial" w:hAnsi="Arial" w:cs="Arial"/>
+          <w:sz w:val="22"/>
+          <w:szCs w:val="22"/>
+        </w:rPr>
+        <w:t xml:space="preserve"> los mensajes de inicialización de un dispositivo emulado vs uno </w:t>
+      </w:r>
+      <w:proofErr w:type="spellStart"/>
+      <w:r>
+        <w:rPr>
+          <w:rFonts w:ascii="Arial" w:eastAsia="Arial" w:hAnsi="Arial" w:cs="Arial"/>
+          <w:sz w:val="22"/>
+          <w:szCs w:val="22"/>
+        </w:rPr>
+        <w:t>VirtIO</w:t>
+      </w:r>
+      <w:proofErr w:type="spellEnd"/>
+      <w:r>
+        <w:rPr>
+          <w:rFonts w:ascii="Arial" w:eastAsia="Arial" w:hAnsi="Arial" w:cs="Arial"/>
+          <w:sz w:val="22"/>
+          <w:szCs w:val="22"/>
+        </w:rPr>
+        <w:t xml:space="preserve">. ¿Cuál genera más líneas? ¿Qué implica eso sobre el </w:t>
+      </w:r>
+      <w:proofErr w:type="spellStart"/>
+      <w:r>
+        <w:rPr>
+          <w:rFonts w:ascii="Arial" w:eastAsia="Arial" w:hAnsi="Arial" w:cs="Arial"/>
+          <w:sz w:val="22"/>
+          <w:szCs w:val="22"/>
+        </w:rPr>
+        <w:t>overhead</w:t>
+      </w:r>
+      <w:proofErr w:type="spellEnd"/>
+      <w:r>
+        <w:rPr>
+          <w:rFonts w:ascii="Arial" w:eastAsia="Arial" w:hAnsi="Arial" w:cs="Arial"/>
+          <w:sz w:val="22"/>
+          <w:szCs w:val="22"/>
+        </w:rPr>
+        <w:t xml:space="preserve"> de la emulación completa?</w:t>
+      </w:r>
+    </w:p>
+    <w:p>
+      <w:pPr>
+        <w:pStyle w:val="Prrafodelista"/>
+        <w:numPr>
+          <w:ilvl w:val="0"/>
+          <w:numId w:val="11"/>
+        </w:numPr>
+        <w:spacing w:before="60" w:after="60" w:line="240" w:lineRule="auto"/>
+        <w:contextualSpacing w:val="0"/>
+      </w:pPr>
+      <w:r>
+        <w:rPr>
+          <w:rFonts w:ascii="Arial" w:eastAsia="Arial" w:hAnsi="Arial" w:cs="Arial"/>
+          <w:sz w:val="22"/>
+          <w:szCs w:val="22"/>
+        </w:rPr>
+        <w:t xml:space="preserve">Explicar con evidencia propia del laboratorio: ¿por qué la </w:t>
+      </w:r>
+      <w:proofErr w:type="spellStart"/>
+      <w:r>
+        <w:rPr>
+          <w:rFonts w:ascii="Arial" w:eastAsia="Arial" w:hAnsi="Arial" w:cs="Arial"/>
+          <w:sz w:val="22"/>
+          <w:szCs w:val="22"/>
+        </w:rPr>
+        <w:t>paravirtualización</w:t>
+      </w:r>
+      <w:proofErr w:type="spellEnd"/>
+      <w:r>
+        <w:rPr>
+          <w:rFonts w:ascii="Arial" w:eastAsia="Arial" w:hAnsi="Arial" w:cs="Arial"/>
+          <w:sz w:val="22"/>
+          <w:szCs w:val="22"/>
+        </w:rPr>
+        <w:t xml:space="preserve"> requiere un driver especial en el SO huésped mientras que la emulación completa no?</w:t>
+      </w:r>
+    </w:p>
+    <w:p>
+      <w:pPr>
+        <w:pStyle w:val="Prrafodelista"/>
+        <w:spacing w:before="60" w:after="60" w:line="240" w:lineRule="auto"/>
+        <w:contextualSpacing w:val="0"/>
+      </w:pPr>
+      <w:r>
+        <w:rPr>
+          <w:rFonts w:ascii="Arial" w:eastAsia="Arial" w:hAnsi="Arial" w:cs="Arial"/>
+          <w:sz w:val="22"/>
+          <w:szCs w:val="22"/>
+        </w:rPr>
+        <w:lastRenderedPageBreak/>
+        <w:t xml:space="preserve">Al no poseer dispositivos </w:t>
+      </w:r>
+      <w:proofErr w:type="spellStart"/>
+      <w:proofErr w:type="gramStart"/>
+      <w:r>
+        <w:rPr>
+          <w:rFonts w:ascii="Arial" w:eastAsia="Arial" w:hAnsi="Arial" w:cs="Arial"/>
+          <w:sz w:val="22"/>
+          <w:szCs w:val="22"/>
+        </w:rPr>
+        <w:t>virtlo</w:t>
+      </w:r>
+      <w:proofErr w:type="spellEnd"/>
+      <w:r>
+        <w:rPr>
+          <w:rFonts w:ascii="Arial" w:eastAsia="Arial" w:hAnsi="Arial" w:cs="Arial"/>
+          <w:sz w:val="22"/>
+          <w:szCs w:val="22"/>
+        </w:rPr>
+        <w:t>(</w:t>
+      </w:r>
+      <w:proofErr w:type="spellStart"/>
+      <w:proofErr w:type="gramEnd"/>
+      <w:r>
+        <w:rPr>
+          <w:rFonts w:ascii="Arial" w:eastAsia="Arial" w:hAnsi="Arial" w:cs="Arial"/>
+          <w:sz w:val="22"/>
+          <w:szCs w:val="22"/>
+        </w:rPr>
+        <w:t>Paravirtualizados</w:t>
+      </w:r>
+      <w:proofErr w:type="spellEnd"/>
+      <w:r>
+        <w:rPr>
+          <w:rFonts w:ascii="Arial" w:eastAsia="Arial" w:hAnsi="Arial" w:cs="Arial"/>
+          <w:sz w:val="22"/>
+          <w:szCs w:val="22"/>
+        </w:rPr>
+        <w:t>) no se puede responder las 3 preguntas anteriores.</w:t>
+      </w:r>
+    </w:p>
+    <w:p>
+      <w:pPr>
+        <w:spacing w:before="220" w:after="100"/>
+      </w:pPr>
+      <w:r>
+        <w:rPr>
+          <w:rFonts w:ascii="Arial" w:eastAsia="Arial" w:hAnsi="Arial" w:cs="Arial"/>
+          <w:b/>
+          <w:bCs/>
+          <w:color w:val="B03A2E"/>
+        </w:rPr>
         <w:t>E1. Experimentos del Subsistema de E/S: E/S de Dispositivos de Caracteres (/</w:t>
       </w:r>
       <w:proofErr w:type="spellStart"/>
@@ -8901,13 +9797,13 @@
           <w:noProof/>
         </w:rPr>
         <w:drawing>
-          <wp:anchor distT="0" distB="0" distL="114300" distR="114300" simplePos="0" relativeHeight="251686912" behindDoc="0" locked="0" layoutInCell="1" allowOverlap="1" wp14:anchorId="3A276AEF" wp14:editId="61A4F967">
+          <wp:anchor distT="0" distB="0" distL="114300" distR="114300" simplePos="0" relativeHeight="251686912" behindDoc="0" locked="0" layoutInCell="1" allowOverlap="1" wp14:anchorId="3A276AEF" wp14:editId="59F7A4FF">
             <wp:simplePos x="0" y="0"/>
             <wp:positionH relativeFrom="column">
-              <wp:posOffset>249844</wp:posOffset>
+              <wp:posOffset>154305</wp:posOffset>
             </wp:positionH>
             <wp:positionV relativeFrom="paragraph">
-              <wp:posOffset>71813</wp:posOffset>
+              <wp:posOffset>5080</wp:posOffset>
             </wp:positionV>
             <wp:extent cx="5611678" cy="2718031"/>
             <wp:effectExtent l="0" t="0" r="8255" b="6350"/>
@@ -8926,7 +9822,7 @@
                     </pic:cNvPicPr>
                   </pic:nvPicPr>
                   <pic:blipFill>
-                    <a:blip r:embed="rId45">
+                    <a:blip r:embed="rId50">
                       <a:extLst>
                         <a:ext uri="{28A0092B-C50C-407E-A947-70E740481C1C}">
                           <a14:useLocalDpi xmlns:a14="http://schemas.microsoft.com/office/drawing/2010/main" val="0"/>
@@ -9006,14 +9902,10 @@
         <w:spacing w:before="60" w:after="60" w:line="240" w:lineRule="auto"/>
       </w:pPr>
     </w:p>
-    <w:p>
-      <w:pPr>
-        <w:spacing w:before="60" w:after="60" w:line="240" w:lineRule="auto"/>
-      </w:pPr>
-    </w:p>
     <w:tbl>
       <w:tblPr>
         <w:tblStyle w:val="Tablaconcuadrcula"/>
+        <w:tblpPr w:leftFromText="141" w:rightFromText="141" w:vertAnchor="page" w:horzAnchor="margin" w:tblpY="11624"/>
         <w:tblW w:w="0" w:type="auto"/>
         <w:tblLook w:val="04A0" w:firstRow="1" w:lastRow="0" w:firstColumn="1" w:lastColumn="0" w:noHBand="0" w:noVBand="1"/>
       </w:tblPr>
@@ -9108,7 +10000,6 @@
                 <w:szCs w:val="22"/>
               </w:rPr>
             </w:pPr>
-            <w:proofErr w:type="spellStart"/>
             <w:r>
               <w:rPr>
                 <w:rFonts w:ascii="Arial" w:hAnsi="Arial" w:cs="Arial"/>
@@ -9117,7 +10008,6 @@
               </w:rPr>
               <w:t>Minor</w:t>
             </w:r>
-            <w:proofErr w:type="spellEnd"/>
           </w:p>
         </w:tc>
       </w:tr>
@@ -9709,6 +10599,7 @@
                 <w:sz w:val="22"/>
                 <w:szCs w:val="22"/>
               </w:rPr>
+              <w:lastRenderedPageBreak/>
               <w:t>loop1</w:t>
             </w:r>
           </w:p>
@@ -9828,15 +10719,7 @@
                 <w:sz w:val="22"/>
                 <w:szCs w:val="22"/>
               </w:rPr>
-              <w:t>c</w:t>
-            </w:r>
-            <w:r>
-              <w:rPr>
-                <w:rFonts w:ascii="Arial" w:hAnsi="Arial" w:cs="Arial"/>
-                <w:sz w:val="22"/>
-                <w:szCs w:val="22"/>
-              </w:rPr>
-              <w:t xml:space="preserve"> (Carácter)</w:t>
+              <w:t>c (Carácter)</w:t>
             </w:r>
           </w:p>
         </w:tc>
@@ -9932,15 +10815,7 @@
                 <w:sz w:val="22"/>
                 <w:szCs w:val="22"/>
               </w:rPr>
-              <w:t>c</w:t>
-            </w:r>
-            <w:r>
-              <w:rPr>
-                <w:rFonts w:ascii="Arial" w:hAnsi="Arial" w:cs="Arial"/>
-                <w:sz w:val="22"/>
-                <w:szCs w:val="22"/>
-              </w:rPr>
-              <w:t xml:space="preserve"> (Carácter)</w:t>
+              <w:t>c (Carácter)</w:t>
             </w:r>
           </w:p>
         </w:tc>
@@ -10036,15 +10911,7 @@
                 <w:sz w:val="22"/>
                 <w:szCs w:val="22"/>
               </w:rPr>
-              <w:t xml:space="preserve">c </w:t>
-            </w:r>
-            <w:r>
-              <w:rPr>
-                <w:rFonts w:ascii="Arial" w:hAnsi="Arial" w:cs="Arial"/>
-                <w:sz w:val="22"/>
-                <w:szCs w:val="22"/>
-              </w:rPr>
-              <w:t>(Carácter)</w:t>
+              <w:t>c (Carácter)</w:t>
             </w:r>
           </w:p>
         </w:tc>
@@ -10259,7 +11126,7 @@
                     </pic:cNvPicPr>
                   </pic:nvPicPr>
                   <pic:blipFill>
-                    <a:blip r:embed="rId46">
+                    <a:blip r:embed="rId51">
                       <a:extLst>
                         <a:ext uri="{28A0092B-C50C-407E-A947-70E740481C1C}">
                           <a14:useLocalDpi xmlns:a14="http://schemas.microsoft.com/office/drawing/2010/main" val="0"/>
@@ -10509,6 +11376,7 @@
         <w:t xml:space="preserve"> generadas. ¿Qué devuelve </w:t>
       </w:r>
       <w:proofErr w:type="spellStart"/>
+      <w:proofErr w:type="gramStart"/>
       <w:r>
         <w:rPr>
           <w:rFonts w:ascii="Arial" w:eastAsia="Arial" w:hAnsi="Arial" w:cs="Arial"/>
@@ -10524,7 +11392,16 @@
           <w:sz w:val="22"/>
           <w:szCs w:val="22"/>
         </w:rPr>
-        <w:t>() cuando lee de /</w:t>
+        <w:t>(</w:t>
+      </w:r>
+      <w:proofErr w:type="gramEnd"/>
+      <w:r>
+        <w:rPr>
+          <w:rFonts w:ascii="Arial" w:eastAsia="Arial" w:hAnsi="Arial" w:cs="Arial"/>
+          <w:sz w:val="22"/>
+          <w:szCs w:val="22"/>
+        </w:rPr>
+        <w:t>) cuando lee de /</w:t>
       </w:r>
       <w:proofErr w:type="spellStart"/>
       <w:r>
@@ -10563,6 +11440,7 @@
         <w:t xml:space="preserve">? ¿Y </w:t>
       </w:r>
       <w:proofErr w:type="spellStart"/>
+      <w:proofErr w:type="gramStart"/>
       <w:r>
         <w:rPr>
           <w:rFonts w:ascii="Arial" w:eastAsia="Arial" w:hAnsi="Arial" w:cs="Arial"/>
@@ -10578,7 +11456,16 @@
           <w:sz w:val="22"/>
           <w:szCs w:val="22"/>
         </w:rPr>
-        <w:t>() cuando escribe a /</w:t>
+        <w:t>(</w:t>
+      </w:r>
+      <w:proofErr w:type="gramEnd"/>
+      <w:r>
+        <w:rPr>
+          <w:rFonts w:ascii="Arial" w:eastAsia="Arial" w:hAnsi="Arial" w:cs="Arial"/>
+          <w:sz w:val="22"/>
+          <w:szCs w:val="22"/>
+        </w:rPr>
+        <w:t>) cuando escribe a /</w:t>
       </w:r>
       <w:proofErr w:type="spellStart"/>
       <w:r>
@@ -10651,7 +11538,7 @@
                     </pic:cNvPicPr>
                   </pic:nvPicPr>
                   <pic:blipFill>
-                    <a:blip r:embed="rId47">
+                    <a:blip r:embed="rId52">
                       <a:extLst>
                         <a:ext uri="{28A0092B-C50C-407E-A947-70E740481C1C}">
                           <a14:useLocalDpi xmlns:a14="http://schemas.microsoft.com/office/drawing/2010/main" val="0"/>
@@ -10727,9 +11614,26 @@
           <w:sz w:val="22"/>
           <w:szCs w:val="22"/>
         </w:rPr>
-        <w:lastRenderedPageBreak/>
         <w:tab/>
-        <w:t>Cuando Read() lee /</w:t>
+        <w:t xml:space="preserve">Cuando </w:t>
+      </w:r>
+      <w:proofErr w:type="gramStart"/>
+      <w:r>
+        <w:rPr>
+          <w:rFonts w:ascii="Arial" w:hAnsi="Arial" w:cs="Arial"/>
+          <w:sz w:val="22"/>
+          <w:szCs w:val="22"/>
+        </w:rPr>
+        <w:t>Read(</w:t>
+      </w:r>
+      <w:proofErr w:type="gramEnd"/>
+      <w:r>
+        <w:rPr>
+          <w:rFonts w:ascii="Arial" w:hAnsi="Arial" w:cs="Arial"/>
+          <w:sz w:val="22"/>
+          <w:szCs w:val="22"/>
+        </w:rPr>
+        <w:t>) lee /</w:t>
       </w:r>
       <w:proofErr w:type="spellStart"/>
       <w:r>
@@ -10765,7 +11669,25 @@
           <w:sz w:val="22"/>
           <w:szCs w:val="22"/>
         </w:rPr>
-        <w:t xml:space="preserve"> este devuelve el numero de bytes solicitados que en este caso son 4096. Por otra parte </w:t>
+        <w:t xml:space="preserve"> este devuelve el numero de bytes solicitados que en este caso son 4096. Por otra </w:t>
+      </w:r>
+      <w:proofErr w:type="gramStart"/>
+      <w:r>
+        <w:rPr>
+          <w:rFonts w:ascii="Arial" w:hAnsi="Arial" w:cs="Arial"/>
+          <w:sz w:val="22"/>
+          <w:szCs w:val="22"/>
+        </w:rPr>
+        <w:t>parte</w:t>
+      </w:r>
+      <w:proofErr w:type="gramEnd"/>
+      <w:r>
+        <w:rPr>
+          <w:rFonts w:ascii="Arial" w:hAnsi="Arial" w:cs="Arial"/>
+          <w:sz w:val="22"/>
+          <w:szCs w:val="22"/>
+        </w:rPr>
+        <w:t xml:space="preserve"> </w:t>
       </w:r>
       <w:proofErr w:type="spellStart"/>
       <w:r>
@@ -10936,6 +11858,7 @@
         <w:t xml:space="preserve">/ y encontrar la entrada correspondiente al </w:t>
       </w:r>
       <w:proofErr w:type="spellStart"/>
+      <w:proofErr w:type="gramStart"/>
       <w:r>
         <w:rPr>
           <w:rFonts w:ascii="Arial" w:eastAsia="Arial" w:hAnsi="Arial" w:cs="Arial"/>
@@ -10945,6 +11868,7 @@
         <w:t>major:minor</w:t>
       </w:r>
       <w:proofErr w:type="spellEnd"/>
+      <w:proofErr w:type="gramEnd"/>
       <w:r>
         <w:rPr>
           <w:rFonts w:ascii="Arial" w:eastAsia="Arial" w:hAnsi="Arial" w:cs="Arial"/>
@@ -11132,7 +12056,7 @@
                     </pic:cNvPicPr>
                   </pic:nvPicPr>
                   <pic:blipFill>
-                    <a:blip r:embed="rId48">
+                    <a:blip r:embed="rId53">
                       <a:extLst>
                         <a:ext uri="{28A0092B-C50C-407E-A947-70E740481C1C}">
                           <a14:useLocalDpi xmlns:a14="http://schemas.microsoft.com/office/drawing/2010/main" val="0"/>
@@ -11213,7 +12137,7 @@
                     </pic:cNvPicPr>
                   </pic:nvPicPr>
                   <pic:blipFill>
-                    <a:blip r:embed="rId49">
+                    <a:blip r:embed="rId54">
                       <a:extLst>
                         <a:ext uri="{28A0092B-C50C-407E-A947-70E740481C1C}">
                           <a14:useLocalDpi xmlns:a14="http://schemas.microsoft.com/office/drawing/2010/main" val="0"/>
@@ -11391,7 +12315,25 @@
           <w:sz w:val="22"/>
           <w:szCs w:val="22"/>
         </w:rPr>
-        <w:t xml:space="preserve"> no esta en el hardware si no que es un software gestionado por el subsistema de Linux.</w:t>
+        <w:t xml:space="preserve"> no </w:t>
+      </w:r>
+      <w:proofErr w:type="spellStart"/>
+      <w:r>
+        <w:rPr>
+          <w:rFonts w:ascii="Arial" w:hAnsi="Arial" w:cs="Arial"/>
+          <w:sz w:val="22"/>
+          <w:szCs w:val="22"/>
+        </w:rPr>
+        <w:t>esta</w:t>
+      </w:r>
+      <w:proofErr w:type="spellEnd"/>
+      <w:r>
+        <w:rPr>
+          <w:rFonts w:ascii="Arial" w:hAnsi="Arial" w:cs="Arial"/>
+          <w:sz w:val="22"/>
+          <w:szCs w:val="22"/>
+        </w:rPr>
+        <w:t xml:space="preserve"> en el hardware si no que es un software gestionado por el subsistema de Linux.</w:t>
       </w:r>
     </w:p>
     <w:p>
@@ -11464,18 +12406,8 @@
           <w:sz w:val="22"/>
           <w:szCs w:val="22"/>
         </w:rPr>
-        <w:t xml:space="preserve">M: </w:t>
-      </w:r>
-      <w:proofErr w:type="spellStart"/>
-      <w:r>
-        <w:rPr>
-          <w:rFonts w:ascii="Arial" w:hAnsi="Arial" w:cs="Arial"/>
-          <w:sz w:val="22"/>
-          <w:szCs w:val="22"/>
-        </w:rPr>
-        <w:t>Random</w:t>
-      </w:r>
-      <w:proofErr w:type="spellEnd"/>
+        <w:t>M: Random</w:t>
+      </w:r>
     </w:p>
     <w:p>
       <w:pPr>
@@ -11847,7 +12779,25 @@
           <w:sz w:val="22"/>
           <w:szCs w:val="22"/>
         </w:rPr>
-        <w:t xml:space="preserve">: ejecutar timeout 3 </w:t>
+        <w:t xml:space="preserve">: ejecutar </w:t>
+      </w:r>
+      <w:proofErr w:type="spellStart"/>
+      <w:r>
+        <w:rPr>
+          <w:rFonts w:ascii="Arial" w:eastAsia="Arial" w:hAnsi="Arial" w:cs="Arial"/>
+          <w:sz w:val="22"/>
+          <w:szCs w:val="22"/>
+        </w:rPr>
+        <w:t>timeout</w:t>
+      </w:r>
+      <w:proofErr w:type="spellEnd"/>
+      <w:r>
+        <w:rPr>
+          <w:rFonts w:ascii="Arial" w:eastAsia="Arial" w:hAnsi="Arial" w:cs="Arial"/>
+          <w:sz w:val="22"/>
+          <w:szCs w:val="22"/>
+        </w:rPr>
+        <w:t xml:space="preserve"> 3 </w:t>
       </w:r>
       <w:proofErr w:type="spellStart"/>
       <w:r>
@@ -12009,7 +12959,25 @@
           <w:sz w:val="22"/>
           <w:szCs w:val="22"/>
         </w:rPr>
-        <w:t>/kernel/</w:t>
+        <w:t>/</w:t>
+      </w:r>
+      <w:proofErr w:type="spellStart"/>
+      <w:r>
+        <w:rPr>
+          <w:rFonts w:ascii="Arial" w:eastAsia="Arial" w:hAnsi="Arial" w:cs="Arial"/>
+          <w:sz w:val="22"/>
+          <w:szCs w:val="22"/>
+        </w:rPr>
+        <w:t>kernel</w:t>
+      </w:r>
+      <w:proofErr w:type="spellEnd"/>
+      <w:r>
+        <w:rPr>
+          <w:rFonts w:ascii="Arial" w:eastAsia="Arial" w:hAnsi="Arial" w:cs="Arial"/>
+          <w:sz w:val="22"/>
+          <w:szCs w:val="22"/>
+        </w:rPr>
+        <w:t>/</w:t>
       </w:r>
       <w:proofErr w:type="spellStart"/>
       <w:r>
@@ -12065,7 +13033,6 @@
         <w:rPr>
           <w:noProof/>
         </w:rPr>
-        <w:lastRenderedPageBreak/>
         <w:drawing>
           <wp:anchor distT="0" distB="0" distL="114300" distR="114300" simplePos="0" relativeHeight="251692032" behindDoc="0" locked="0" layoutInCell="1" allowOverlap="1" wp14:anchorId="3716C550" wp14:editId="6F655425">
             <wp:simplePos x="0" y="0"/>
@@ -12092,7 +13059,7 @@
                     </pic:cNvPicPr>
                   </pic:nvPicPr>
                   <pic:blipFill>
-                    <a:blip r:embed="rId50">
+                    <a:blip r:embed="rId55">
                       <a:extLst>
                         <a:ext uri="{28A0092B-C50C-407E-A947-70E740481C1C}">
                           <a14:useLocalDpi xmlns:a14="http://schemas.microsoft.com/office/drawing/2010/main" val="0"/>
@@ -12204,6 +13171,7 @@
           <w:sz w:val="22"/>
           <w:szCs w:val="22"/>
         </w:rPr>
+        <w:lastRenderedPageBreak/>
         <w:t>¿Qué es la entropía de kernel?</w:t>
       </w:r>
     </w:p>
@@ -12320,7 +13288,7 @@
           <w:noProof/>
         </w:rPr>
         <w:drawing>
-          <wp:anchor distT="0" distB="0" distL="114300" distR="114300" simplePos="0" relativeHeight="251693056" behindDoc="0" locked="0" layoutInCell="1" allowOverlap="1" wp14:anchorId="569B6F48" wp14:editId="78594B9B">
+          <wp:anchor distT="0" distB="0" distL="114300" distR="114300" simplePos="0" relativeHeight="251693056" behindDoc="0" locked="0" layoutInCell="1" allowOverlap="1" wp14:anchorId="569B6F48" wp14:editId="5FCE9ADE">
             <wp:simplePos x="0" y="0"/>
             <wp:positionH relativeFrom="margin">
               <wp:align>right</wp:align>
@@ -12345,7 +13313,7 @@
                     </pic:cNvPicPr>
                   </pic:nvPicPr>
                   <pic:blipFill>
-                    <a:blip r:embed="rId51" cstate="print">
+                    <a:blip r:embed="rId56" cstate="print">
                       <a:extLst>
                         <a:ext uri="{28A0092B-C50C-407E-A947-70E740481C1C}">
                           <a14:useLocalDpi xmlns:a14="http://schemas.microsoft.com/office/drawing/2010/main" val="0"/>
@@ -12489,7 +13457,6 @@
           <w:sz w:val="22"/>
           <w:szCs w:val="22"/>
         </w:rPr>
-        <w:lastRenderedPageBreak/>
         <w:tab/>
         <w:t>El tiempo de clonado tomo alrededor de unos 3 minutos, esto se debe a que la PC cuenta con sata SSD, además, el tamaño del archivo VDI de ambas son exactamente el mismo.</w:t>
       </w:r>
@@ -12549,7 +13516,25 @@
           <w:sz w:val="22"/>
           <w:szCs w:val="22"/>
         </w:rPr>
-        <w:t xml:space="preserve"> virtual linked.</w:t>
+        <w:t xml:space="preserve"> virtual </w:t>
+      </w:r>
+      <w:proofErr w:type="spellStart"/>
+      <w:r>
+        <w:rPr>
+          <w:rFonts w:ascii="Arial" w:hAnsi="Arial" w:cs="Arial"/>
+          <w:sz w:val="22"/>
+          <w:szCs w:val="22"/>
+        </w:rPr>
+        <w:t>linked</w:t>
+      </w:r>
+      <w:proofErr w:type="spellEnd"/>
+      <w:r>
+        <w:rPr>
+          <w:rFonts w:ascii="Arial" w:hAnsi="Arial" w:cs="Arial"/>
+          <w:sz w:val="22"/>
+          <w:szCs w:val="22"/>
+        </w:rPr>
+        <w:t>.</w:t>
       </w:r>
     </w:p>
     <w:p>
@@ -12585,6 +13570,7 @@
         <w:rPr>
           <w:noProof/>
         </w:rPr>
+        <w:lastRenderedPageBreak/>
         <w:drawing>
           <wp:anchor distT="0" distB="0" distL="114300" distR="114300" simplePos="0" relativeHeight="251694080" behindDoc="0" locked="0" layoutInCell="1" allowOverlap="1" wp14:anchorId="27DDF8BD" wp14:editId="6F10AC2B">
             <wp:simplePos x="0" y="0"/>
@@ -12611,7 +13597,7 @@
                     </pic:cNvPicPr>
                   </pic:nvPicPr>
                   <pic:blipFill rotWithShape="1">
-                    <a:blip r:embed="rId52">
+                    <a:blip r:embed="rId57">
                       <a:extLst>
                         <a:ext uri="{28A0092B-C50C-407E-A947-70E740481C1C}">
                           <a14:useLocalDpi xmlns:a14="http://schemas.microsoft.com/office/drawing/2010/main" val="0"/>
@@ -12742,7 +13728,7 @@
                     </pic:cNvPicPr>
                   </pic:nvPicPr>
                   <pic:blipFill rotWithShape="1">
-                    <a:blip r:embed="rId53">
+                    <a:blip r:embed="rId58">
                       <a:extLst>
                         <a:ext uri="{28A0092B-C50C-407E-A947-70E740481C1C}">
                           <a14:useLocalDpi xmlns:a14="http://schemas.microsoft.com/office/drawing/2010/main" val="0"/>
@@ -13020,16 +14006,16 @@
           <w:noProof/>
         </w:rPr>
         <w:drawing>
-          <wp:anchor distT="0" distB="0" distL="114300" distR="114300" simplePos="0" relativeHeight="251696128" behindDoc="0" locked="0" layoutInCell="1" allowOverlap="1" wp14:anchorId="06651371" wp14:editId="01DC7EA3">
+          <wp:anchor distT="0" distB="0" distL="114300" distR="114300" simplePos="0" relativeHeight="251696128" behindDoc="0" locked="0" layoutInCell="1" allowOverlap="1" wp14:anchorId="06651371" wp14:editId="5B3F1135">
             <wp:simplePos x="0" y="0"/>
-            <wp:positionH relativeFrom="column">
-              <wp:posOffset>-54784</wp:posOffset>
+            <wp:positionH relativeFrom="margin">
+              <wp:posOffset>-203835</wp:posOffset>
             </wp:positionH>
             <wp:positionV relativeFrom="paragraph">
-              <wp:posOffset>3202</wp:posOffset>
+              <wp:posOffset>19685</wp:posOffset>
             </wp:positionV>
-            <wp:extent cx="5603875" cy="2290445"/>
-            <wp:effectExtent l="0" t="0" r="0" b="0"/>
+            <wp:extent cx="6477000" cy="2910205"/>
+            <wp:effectExtent l="0" t="0" r="0" b="4445"/>
             <wp:wrapNone/>
             <wp:docPr id="39" name="Imagen 39"/>
             <wp:cNvGraphicFramePr>
@@ -13045,7 +14031,7 @@
                     </pic:cNvPicPr>
                   </pic:nvPicPr>
                   <pic:blipFill>
-                    <a:blip r:embed="rId54" cstate="print">
+                    <a:blip r:embed="rId59" cstate="print">
                       <a:extLst>
                         <a:ext uri="{28A0092B-C50C-407E-A947-70E740481C1C}">
                           <a14:useLocalDpi xmlns:a14="http://schemas.microsoft.com/office/drawing/2010/main" val="0"/>
@@ -13060,7 +14046,7 @@
                   <pic:spPr bwMode="auto">
                     <a:xfrm>
                       <a:off x="0" y="0"/>
-                      <a:ext cx="5603875" cy="2290445"/>
+                      <a:ext cx="6477685" cy="2910513"/>
                     </a:xfrm>
                     <a:prstGeom prst="rect">
                       <a:avLst/>
@@ -13073,6 +14059,9 @@
                 </pic:pic>
               </a:graphicData>
             </a:graphic>
+            <wp14:sizeRelH relativeFrom="margin">
+              <wp14:pctWidth>0</wp14:pctWidth>
+            </wp14:sizeRelH>
             <wp14:sizeRelV relativeFrom="margin">
               <wp14:pctHeight>0</wp14:pctHeight>
             </wp14:sizeRelV>
@@ -13114,85 +14103,186 @@
       <w:pPr>
         <w:spacing w:before="60" w:after="60" w:line="240" w:lineRule="auto"/>
         <w:jc w:val="both"/>
-        <w:rPr>
-          <w:rFonts w:ascii="Arial" w:hAnsi="Arial" w:cs="Arial"/>
-          <w:sz w:val="22"/>
-          <w:szCs w:val="22"/>
-        </w:rPr>
-      </w:pPr>
-      <w:r>
+      </w:pPr>
+    </w:p>
+    <w:p>
+      <w:pPr>
+        <w:spacing w:before="60" w:after="60" w:line="240" w:lineRule="auto"/>
+        <w:jc w:val="both"/>
+      </w:pPr>
+    </w:p>
+    <w:p>
+      <w:pPr>
+        <w:spacing w:before="60" w:after="60" w:line="240" w:lineRule="auto"/>
+        <w:jc w:val="both"/>
+      </w:pPr>
+    </w:p>
+    <w:p>
+      <w:pPr>
+        <w:spacing w:before="60" w:after="60" w:line="240" w:lineRule="auto"/>
+        <w:jc w:val="both"/>
+      </w:pPr>
+      <w:r>
+        <w:tab/>
+      </w:r>
+    </w:p>
+    <w:p>
+      <w:pPr>
+        <w:spacing w:before="60" w:after="60" w:line="240" w:lineRule="auto"/>
+        <w:jc w:val="both"/>
+        <w:rPr>
+          <w:rFonts w:ascii="Arial" w:hAnsi="Arial" w:cs="Arial"/>
+          <w:sz w:val="22"/>
+          <w:szCs w:val="22"/>
+        </w:rPr>
+      </w:pPr>
+    </w:p>
+    <w:p>
+      <w:pPr>
+        <w:spacing w:before="60" w:after="60" w:line="240" w:lineRule="auto"/>
+        <w:jc w:val="both"/>
+        <w:rPr>
+          <w:rFonts w:ascii="Arial" w:hAnsi="Arial" w:cs="Arial"/>
+          <w:sz w:val="22"/>
+          <w:szCs w:val="22"/>
+        </w:rPr>
+      </w:pPr>
+    </w:p>
+    <w:p>
+      <w:pPr>
+        <w:spacing w:before="60" w:after="60" w:line="240" w:lineRule="auto"/>
+        <w:jc w:val="both"/>
+        <w:rPr>
+          <w:rFonts w:ascii="Arial" w:hAnsi="Arial" w:cs="Arial"/>
+          <w:sz w:val="22"/>
+          <w:szCs w:val="22"/>
+        </w:rPr>
+      </w:pPr>
+    </w:p>
+    <w:p>
+      <w:pPr>
+        <w:spacing w:before="60" w:after="60" w:line="240" w:lineRule="auto"/>
+        <w:jc w:val="both"/>
+        <w:rPr>
+          <w:rFonts w:ascii="Arial" w:hAnsi="Arial" w:cs="Arial"/>
+          <w:sz w:val="22"/>
+          <w:szCs w:val="22"/>
+        </w:rPr>
+      </w:pPr>
+      <w:r>
+        <w:rPr>
+          <w:rFonts w:ascii="Arial" w:hAnsi="Arial" w:cs="Arial"/>
+          <w:sz w:val="22"/>
+          <w:szCs w:val="22"/>
+        </w:rPr>
+        <w:t xml:space="preserve">El </w:t>
+      </w:r>
+      <w:proofErr w:type="spellStart"/>
+      <w:r>
+        <w:rPr>
+          <w:rFonts w:ascii="Arial" w:hAnsi="Arial" w:cs="Arial"/>
+          <w:sz w:val="22"/>
+          <w:szCs w:val="22"/>
+        </w:rPr>
+        <w:t>linked</w:t>
+      </w:r>
+      <w:proofErr w:type="spellEnd"/>
+      <w:r>
+        <w:rPr>
+          <w:rFonts w:ascii="Arial" w:hAnsi="Arial" w:cs="Arial"/>
+          <w:sz w:val="22"/>
+          <w:szCs w:val="22"/>
+        </w:rPr>
+        <w:t xml:space="preserve"> clone genera </w:t>
+      </w:r>
+      <w:proofErr w:type="spellStart"/>
+      <w:r>
+        <w:rPr>
+          <w:rFonts w:ascii="Arial" w:hAnsi="Arial" w:cs="Arial"/>
+          <w:sz w:val="22"/>
+          <w:szCs w:val="22"/>
+        </w:rPr>
+        <w:t>mas</w:t>
+      </w:r>
+      <w:proofErr w:type="spellEnd"/>
+      <w:r>
+        <w:rPr>
+          <w:rFonts w:ascii="Arial" w:hAnsi="Arial" w:cs="Arial"/>
+          <w:sz w:val="22"/>
+          <w:szCs w:val="22"/>
+        </w:rPr>
+        <w:t xml:space="preserve"> E/S que el anfitrión debido a que el mecanismo </w:t>
+      </w:r>
+      <w:proofErr w:type="spellStart"/>
+      <w:r>
+        <w:rPr>
+          <w:rFonts w:ascii="Arial" w:hAnsi="Arial" w:cs="Arial"/>
+          <w:sz w:val="22"/>
+          <w:szCs w:val="22"/>
+        </w:rPr>
+        <w:t>copy</w:t>
+      </w:r>
+      <w:proofErr w:type="spellEnd"/>
+      <w:r>
+        <w:rPr>
+          <w:rFonts w:ascii="Arial" w:hAnsi="Arial" w:cs="Arial"/>
+          <w:sz w:val="22"/>
+          <w:szCs w:val="22"/>
+        </w:rPr>
+        <w:t xml:space="preserve"> </w:t>
+      </w:r>
+      <w:proofErr w:type="spellStart"/>
+      <w:r>
+        <w:rPr>
+          <w:rFonts w:ascii="Arial" w:hAnsi="Arial" w:cs="Arial"/>
+          <w:sz w:val="22"/>
+          <w:szCs w:val="22"/>
+        </w:rPr>
+        <w:t>on</w:t>
+      </w:r>
+      <w:proofErr w:type="spellEnd"/>
+      <w:r>
+        <w:rPr>
+          <w:rFonts w:ascii="Arial" w:hAnsi="Arial" w:cs="Arial"/>
+          <w:sz w:val="22"/>
+          <w:szCs w:val="22"/>
+        </w:rPr>
+        <w:t xml:space="preserve"> </w:t>
+      </w:r>
+      <w:proofErr w:type="spellStart"/>
+      <w:r>
+        <w:rPr>
+          <w:rFonts w:ascii="Arial" w:hAnsi="Arial" w:cs="Arial"/>
+          <w:sz w:val="22"/>
+          <w:szCs w:val="22"/>
+        </w:rPr>
+        <w:t>write</w:t>
+      </w:r>
+      <w:proofErr w:type="spellEnd"/>
+      <w:r>
+        <w:rPr>
+          <w:rFonts w:ascii="Arial" w:hAnsi="Arial" w:cs="Arial"/>
+          <w:sz w:val="22"/>
+          <w:szCs w:val="22"/>
+        </w:rPr>
+        <w:t xml:space="preserve"> transforma una escritura en un proceso complejo de lectura, modificación y escritura</w:t>
+      </w:r>
+      <w:r>
+        <w:rPr>
+          <w:rFonts w:ascii="Arial" w:hAnsi="Arial" w:cs="Arial"/>
+          <w:sz w:val="22"/>
+          <w:szCs w:val="22"/>
+        </w:rPr>
+        <w:t xml:space="preserve"> que </w:t>
+      </w:r>
+      <w:r>
+        <w:rPr>
+          <w:rFonts w:ascii="Arial" w:hAnsi="Arial" w:cs="Arial"/>
+          <w:sz w:val="22"/>
+          <w:szCs w:val="22"/>
+        </w:rPr>
         <w:lastRenderedPageBreak/>
-        <w:tab/>
-      </w:r>
-      <w:r>
-        <w:rPr>
-          <w:rFonts w:ascii="Arial" w:hAnsi="Arial" w:cs="Arial"/>
-          <w:sz w:val="22"/>
-          <w:szCs w:val="22"/>
-        </w:rPr>
-        <w:t xml:space="preserve">El linked clone genera mas E/S que el anfitrión debido a que el mecanismo </w:t>
-      </w:r>
-      <w:proofErr w:type="spellStart"/>
-      <w:r>
-        <w:rPr>
-          <w:rFonts w:ascii="Arial" w:hAnsi="Arial" w:cs="Arial"/>
-          <w:sz w:val="22"/>
-          <w:szCs w:val="22"/>
-        </w:rPr>
-        <w:t>copy</w:t>
-      </w:r>
-      <w:proofErr w:type="spellEnd"/>
-      <w:r>
-        <w:rPr>
-          <w:rFonts w:ascii="Arial" w:hAnsi="Arial" w:cs="Arial"/>
-          <w:sz w:val="22"/>
-          <w:szCs w:val="22"/>
-        </w:rPr>
-        <w:t xml:space="preserve"> </w:t>
-      </w:r>
-      <w:proofErr w:type="spellStart"/>
-      <w:r>
-        <w:rPr>
-          <w:rFonts w:ascii="Arial" w:hAnsi="Arial" w:cs="Arial"/>
-          <w:sz w:val="22"/>
-          <w:szCs w:val="22"/>
-        </w:rPr>
-        <w:t>on</w:t>
-      </w:r>
-      <w:proofErr w:type="spellEnd"/>
-      <w:r>
-        <w:rPr>
-          <w:rFonts w:ascii="Arial" w:hAnsi="Arial" w:cs="Arial"/>
-          <w:sz w:val="22"/>
-          <w:szCs w:val="22"/>
-        </w:rPr>
-        <w:t xml:space="preserve"> </w:t>
-      </w:r>
-      <w:proofErr w:type="spellStart"/>
-      <w:r>
-        <w:rPr>
-          <w:rFonts w:ascii="Arial" w:hAnsi="Arial" w:cs="Arial"/>
-          <w:sz w:val="22"/>
-          <w:szCs w:val="22"/>
-        </w:rPr>
-        <w:t>write</w:t>
-      </w:r>
-      <w:proofErr w:type="spellEnd"/>
-      <w:r>
-        <w:rPr>
-          <w:rFonts w:ascii="Arial" w:hAnsi="Arial" w:cs="Arial"/>
-          <w:sz w:val="22"/>
-          <w:szCs w:val="22"/>
-        </w:rPr>
-        <w:t xml:space="preserve"> transforma una escritura en un proceso complejo de lectura, modificación y escritura</w:t>
-      </w:r>
-      <w:r>
-        <w:rPr>
-          <w:rFonts w:ascii="Arial" w:hAnsi="Arial" w:cs="Arial"/>
-          <w:sz w:val="22"/>
-          <w:szCs w:val="22"/>
-        </w:rPr>
-        <w:t xml:space="preserve"> que obliga al disco físico del anfitrión a leer constantemente el archivo base para verificar dependencias y luego escribir en el archivo, multiplicando el número de peticiones concurrentes de disco que pueden ser vistas desde </w:t>
+        <w:t xml:space="preserve">obliga al disco físico del anfitrión a leer constantemente el archivo base para verificar dependencias y luego escribir en el archivo, multiplicando el número de peticiones concurrentes de disco que pueden ser vistas desde </w:t>
       </w:r>
       <w:proofErr w:type="spellStart"/>
       <w:r>
@@ -13774,23 +14864,7 @@
                 <w:sz w:val="22"/>
                 <w:szCs w:val="22"/>
               </w:rPr>
-              <w:t xml:space="preserve">El flujo de escritura es directo hacia su propio </w:t>
-            </w:r>
-            <w:r>
-              <w:rPr>
-                <w:rFonts w:ascii="Arial" w:hAnsi="Arial" w:cs="Arial"/>
-                <w:sz w:val="22"/>
-                <w:szCs w:val="22"/>
-              </w:rPr>
-              <w:t>archivo.vdi</w:t>
-            </w:r>
-            <w:r>
-              <w:rPr>
-                <w:rFonts w:ascii="Arial" w:hAnsi="Arial" w:cs="Arial"/>
-                <w:sz w:val="22"/>
-                <w:szCs w:val="22"/>
-              </w:rPr>
-              <w:t>. Es una operación lineal de una sola vía.</w:t>
+              <w:t>El flujo de escritura es directo hacia su propio archivo.vdi. Es una operación lineal de una sola vía.</w:t>
             </w:r>
           </w:p>
         </w:tc>
@@ -14091,7 +15165,7 @@
 </file>
 
 <file path=word/endnotes.xml><?xml version="1.0" encoding="utf-8"?>
-<w:endnotes xmlns:wpc="http://schemas.microsoft.com/office/word/2010/wordprocessingCanvas" xmlns:cx="http://schemas.microsoft.com/office/drawing/2014/chartex" xmlns:cx1="http://schemas.microsoft.com/office/drawing/2015/9/8/chartex" xmlns:cx2="http://schemas.microsoft.com/office/drawing/2015/10/21/chartex" xmlns:cx3="http://schemas.microsoft.com/office/drawing/2016/5/9/chartex" xmlns:cx4="http://schemas.microsoft.com/office/drawing/2016/5/10/chartex" xmlns:cx5="http://schemas.microsoft.com/office/drawing/2016/5/11/chartex" xmlns:cx6="http://schemas.microsoft.com/office/drawing/2016/5/12/chartex" xmlns:cx7="http://schemas.microsoft.com/office/drawing/2016/5/13/chartex" xmlns:cx8="http://schemas.microsoft.com/office/drawing/2016/5/14/chartex" xmlns:mc="http://schemas.openxmlformats.org/markup-compatibility/2006" xmlns:aink="http://schemas.microsoft.com/office/drawing/2016/ink" xmlns:am3d="http://schemas.microsoft.com/office/drawing/2017/model3d" xmlns:o="urn:schemas-microsoft-com:office:office" xmlns:oel="http://schemas.microsoft.com/office/2019/extlst" xmlns:r="http://schemas.openxmlformats.org/officeDocument/2006/relationships" xmlns:m="http://schemas.openxmlformats.org/officeDocument/2006/math" xmlns:v="urn:schemas-microsoft-com:vml" xmlns:wp14="http://schemas.microsoft.com/office/word/2010/wordprocessingDrawing" xmlns:wp="http://schemas.openxmlformats.org/drawingml/2006/wordprocessingDrawing" xmlns:w10="urn:schemas-microsoft-com:office:word" xmlns:w="http://schemas.openxmlformats.org/wordprocessingml/2006/main" xmlns:w14="http://schemas.microsoft.com/office/word/2010/wordml" xmlns:w15="http://schemas.microsoft.com/office/word/2012/wordml" xmlns:w16cex="http://schemas.microsoft.com/office/word/2018/wordml/cex" xmlns:w16cid="http://schemas.microsoft.com/office/word/2016/wordml/cid" xmlns:w16="http://schemas.microsoft.com/office/word/2018/wordml" xmlns:w16sdtdh="http://schemas.microsoft.com/office/word/2020/wordml/sdtdatahash" xmlns:w16se="http://schemas.microsoft.com/office/word/2015/wordml/symex" xmlns:wpg="http://schemas.microsoft.com/office/word/2010/wordprocessingGroup" xmlns:wpi="http://schemas.microsoft.com/office/word/2010/wordprocessingInk" xmlns:wne="http://schemas.microsoft.com/office/word/2006/wordml" xmlns:wps="http://schemas.microsoft.com/office/word/2010/wordprocessingShape" mc:Ignorable="w14 w15 w16se w16cid w16 w16cex w16sdtdh wp14">
+<w:endnotes xmlns:wpc="http://schemas.microsoft.com/office/word/2010/wordprocessingCanvas" xmlns:cx="http://schemas.microsoft.com/office/drawing/2014/chartex" xmlns:cx1="http://schemas.microsoft.com/office/drawing/2015/9/8/chartex" xmlns:cx2="http://schemas.microsoft.com/office/drawing/2015/10/21/chartex" xmlns:cx3="http://schemas.microsoft.com/office/drawing/2016/5/9/chartex" xmlns:cx4="http://schemas.microsoft.com/office/drawing/2016/5/10/chartex" xmlns:cx5="http://schemas.microsoft.com/office/drawing/2016/5/11/chartex" xmlns:cx6="http://schemas.microsoft.com/office/drawing/2016/5/12/chartex" xmlns:cx7="http://schemas.microsoft.com/office/drawing/2016/5/13/chartex" xmlns:cx8="http://schemas.microsoft.com/office/drawing/2016/5/14/chartex" xmlns:mc="http://schemas.openxmlformats.org/markup-compatibility/2006" xmlns:aink="http://schemas.microsoft.com/office/drawing/2016/ink" xmlns:am3d="http://schemas.microsoft.com/office/drawing/2017/model3d" xmlns:o="urn:schemas-microsoft-com:office:office" xmlns:oel="http://schemas.microsoft.com/office/2019/extlst" xmlns:r="http://schemas.openxmlformats.org/officeDocument/2006/relationships" xmlns:m="http://schemas.openxmlformats.org/officeDocument/2006/math" xmlns:v="urn:schemas-microsoft-com:vml" xmlns:wp14="http://schemas.microsoft.com/office/word/2010/wordprocessingDrawing" xmlns:wp="http://schemas.openxmlformats.org/drawingml/2006/wordprocessingDrawing" xmlns:w10="urn:schemas-microsoft-com:office:word" xmlns:w="http://schemas.openxmlformats.org/wordprocessingml/2006/main" xmlns:w14="http://schemas.microsoft.com/office/word/2010/wordml" xmlns:w15="http://schemas.microsoft.com/office/word/2012/wordml" xmlns:w16cex="http://schemas.microsoft.com/office/word/2018/wordml/cex" xmlns:w16cid="http://schemas.microsoft.com/office/word/2016/wordml/cid" xmlns:w16="http://schemas.microsoft.com/office/word/2018/wordml" xmlns:w16du="http://schemas.microsoft.com/office/word/2023/wordml/word16du" xmlns:w16sdtdh="http://schemas.microsoft.com/office/word/2020/wordml/sdtdatahash" xmlns:w16sdtfl="http://schemas.microsoft.com/office/word/2024/wordml/sdtformatlock" xmlns:w16se="http://schemas.microsoft.com/office/word/2015/wordml/symex" xmlns:wpg="http://schemas.microsoft.com/office/word/2010/wordprocessingGroup" xmlns:wpi="http://schemas.microsoft.com/office/word/2010/wordprocessingInk" xmlns:wne="http://schemas.microsoft.com/office/word/2006/wordml" xmlns:wps="http://schemas.microsoft.com/office/word/2010/wordprocessingShape" mc:Ignorable="w14 w15 w16se w16cid w16 w16cex w16sdtdh w16sdtfl w16du wp14">
   <w:endnote w:type="separator" w:id="-1">
     <w:p>
       <w:pPr>
@@ -14116,7 +15190,7 @@
 </file>
 
 <file path=word/footnotes.xml><?xml version="1.0" encoding="utf-8"?>
-<w:footnotes xmlns:wpc="http://schemas.microsoft.com/office/word/2010/wordprocessingCanvas" xmlns:cx="http://schemas.microsoft.com/office/drawing/2014/chartex" xmlns:cx1="http://schemas.microsoft.com/office/drawing/2015/9/8/chartex" xmlns:cx2="http://schemas.microsoft.com/office/drawing/2015/10/21/chartex" xmlns:cx3="http://schemas.microsoft.com/office/drawing/2016/5/9/chartex" xmlns:cx4="http://schemas.microsoft.com/office/drawing/2016/5/10/chartex" xmlns:cx5="http://schemas.microsoft.com/office/drawing/2016/5/11/chartex" xmlns:cx6="http://schemas.microsoft.com/office/drawing/2016/5/12/chartex" xmlns:cx7="http://schemas.microsoft.com/office/drawing/2016/5/13/chartex" xmlns:cx8="http://schemas.microsoft.com/office/drawing/2016/5/14/chartex" xmlns:mc="http://schemas.openxmlformats.org/markup-compatibility/2006" xmlns:aink="http://schemas.microsoft.com/office/drawing/2016/ink" xmlns:am3d="http://schemas.microsoft.com/office/drawing/2017/model3d" xmlns:o="urn:schemas-microsoft-com:office:office" xmlns:oel="http://schemas.microsoft.com/office/2019/extlst" xmlns:r="http://schemas.openxmlformats.org/officeDocument/2006/relationships" xmlns:m="http://schemas.openxmlformats.org/officeDocument/2006/math" xmlns:v="urn:schemas-microsoft-com:vml" xmlns:wp14="http://schemas.microsoft.com/office/word/2010/wordprocessingDrawing" xmlns:wp="http://schemas.openxmlformats.org/drawingml/2006/wordprocessingDrawing" xmlns:w10="urn:schemas-microsoft-com:office:word" xmlns:w="http://schemas.openxmlformats.org/wordprocessingml/2006/main" xmlns:w14="http://schemas.microsoft.com/office/word/2010/wordml" xmlns:w15="http://schemas.microsoft.com/office/word/2012/wordml" xmlns:w16cex="http://schemas.microsoft.com/office/word/2018/wordml/cex" xmlns:w16cid="http://schemas.microsoft.com/office/word/2016/wordml/cid" xmlns:w16="http://schemas.microsoft.com/office/word/2018/wordml" xmlns:w16sdtdh="http://schemas.microsoft.com/office/word/2020/wordml/sdtdatahash" xmlns:w16se="http://schemas.microsoft.com/office/word/2015/wordml/symex" xmlns:wpg="http://schemas.microsoft.com/office/word/2010/wordprocessingGroup" xmlns:wpi="http://schemas.microsoft.com/office/word/2010/wordprocessingInk" xmlns:wne="http://schemas.microsoft.com/office/word/2006/wordml" xmlns:wps="http://schemas.microsoft.com/office/word/2010/wordprocessingShape" mc:Ignorable="w14 w15 w16se w16cid w16 w16cex w16sdtdh wp14">
+<w:footnotes xmlns:wpc="http://schemas.microsoft.com/office/word/2010/wordprocessingCanvas" xmlns:cx="http://schemas.microsoft.com/office/drawing/2014/chartex" xmlns:cx1="http://schemas.microsoft.com/office/drawing/2015/9/8/chartex" xmlns:cx2="http://schemas.microsoft.com/office/drawing/2015/10/21/chartex" xmlns:cx3="http://schemas.microsoft.com/office/drawing/2016/5/9/chartex" xmlns:cx4="http://schemas.microsoft.com/office/drawing/2016/5/10/chartex" xmlns:cx5="http://schemas.microsoft.com/office/drawing/2016/5/11/chartex" xmlns:cx6="http://schemas.microsoft.com/office/drawing/2016/5/12/chartex" xmlns:cx7="http://schemas.microsoft.com/office/drawing/2016/5/13/chartex" xmlns:cx8="http://schemas.microsoft.com/office/drawing/2016/5/14/chartex" xmlns:mc="http://schemas.openxmlformats.org/markup-compatibility/2006" xmlns:aink="http://schemas.microsoft.com/office/drawing/2016/ink" xmlns:am3d="http://schemas.microsoft.com/office/drawing/2017/model3d" xmlns:o="urn:schemas-microsoft-com:office:office" xmlns:oel="http://schemas.microsoft.com/office/2019/extlst" xmlns:r="http://schemas.openxmlformats.org/officeDocument/2006/relationships" xmlns:m="http://schemas.openxmlformats.org/officeDocument/2006/math" xmlns:v="urn:schemas-microsoft-com:vml" xmlns:wp14="http://schemas.microsoft.com/office/word/2010/wordprocessingDrawing" xmlns:wp="http://schemas.openxmlformats.org/drawingml/2006/wordprocessingDrawing" xmlns:w10="urn:schemas-microsoft-com:office:word" xmlns:w="http://schemas.openxmlformats.org/wordprocessingml/2006/main" xmlns:w14="http://schemas.microsoft.com/office/word/2010/wordml" xmlns:w15="http://schemas.microsoft.com/office/word/2012/wordml" xmlns:w16cex="http://schemas.microsoft.com/office/word/2018/wordml/cex" xmlns:w16cid="http://schemas.microsoft.com/office/word/2016/wordml/cid" xmlns:w16="http://schemas.microsoft.com/office/word/2018/wordml" xmlns:w16du="http://schemas.microsoft.com/office/word/2023/wordml/word16du" xmlns:w16sdtdh="http://schemas.microsoft.com/office/word/2020/wordml/sdtdatahash" xmlns:w16sdtfl="http://schemas.microsoft.com/office/word/2024/wordml/sdtformatlock" xmlns:w16se="http://schemas.microsoft.com/office/word/2015/wordml/symex" xmlns:wpg="http://schemas.microsoft.com/office/word/2010/wordprocessingGroup" xmlns:wpi="http://schemas.microsoft.com/office/word/2010/wordprocessingInk" xmlns:wne="http://schemas.microsoft.com/office/word/2006/wordml" xmlns:wps="http://schemas.microsoft.com/office/word/2010/wordprocessingShape" mc:Ignorable="w14 w15 w16se w16cid w16 w16cex w16sdtdh w16sdtfl w16du wp14">
   <w:footnote w:type="separator" w:id="-1">
     <w:p>
       <w:pPr>
@@ -14141,7 +15215,7 @@
 </file>
 
 <file path=word/numbering.xml><?xml version="1.0" encoding="utf-8"?>
-<w:numbering xmlns:wpc="http://schemas.microsoft.com/office/word/2010/wordprocessingCanvas" xmlns:cx="http://schemas.microsoft.com/office/drawing/2014/chartex" xmlns:cx1="http://schemas.microsoft.com/office/drawing/2015/9/8/chartex" xmlns:cx2="http://schemas.microsoft.com/office/drawing/2015/10/21/chartex" xmlns:cx3="http://schemas.microsoft.com/office/drawing/2016/5/9/chartex" xmlns:cx4="http://schemas.microsoft.com/office/drawing/2016/5/10/chartex" xmlns:cx5="http://schemas.microsoft.com/office/drawing/2016/5/11/chartex" xmlns:cx6="http://schemas.microsoft.com/office/drawing/2016/5/12/chartex" xmlns:cx7="http://schemas.microsoft.com/office/drawing/2016/5/13/chartex" xmlns:cx8="http://schemas.microsoft.com/office/drawing/2016/5/14/chartex" xmlns:mc="http://schemas.openxmlformats.org/markup-compatibility/2006" xmlns:aink="http://schemas.microsoft.com/office/drawing/2016/ink" xmlns:am3d="http://schemas.microsoft.com/office/drawing/2017/model3d" xmlns:o="urn:schemas-microsoft-com:office:office" xmlns:oel="http://schemas.microsoft.com/office/2019/extlst" xmlns:r="http://schemas.openxmlformats.org/officeDocument/2006/relationships" xmlns:m="http://schemas.openxmlformats.org/officeDocument/2006/math" xmlns:v="urn:schemas-microsoft-com:vml" xmlns:wp14="http://schemas.microsoft.com/office/word/2010/wordprocessingDrawing" xmlns:wp="http://schemas.openxmlformats.org/drawingml/2006/wordprocessingDrawing" xmlns:w10="urn:schemas-microsoft-com:office:word" xmlns:w="http://schemas.openxmlformats.org/wordprocessingml/2006/main" xmlns:w14="http://schemas.microsoft.com/office/word/2010/wordml" xmlns:w15="http://schemas.microsoft.com/office/word/2012/wordml" xmlns:w16cex="http://schemas.microsoft.com/office/word/2018/wordml/cex" xmlns:w16cid="http://schemas.microsoft.com/office/word/2016/wordml/cid" xmlns:w16="http://schemas.microsoft.com/office/word/2018/wordml" xmlns:w16sdtdh="http://schemas.microsoft.com/office/word/2020/wordml/sdtdatahash" xmlns:w16se="http://schemas.microsoft.com/office/word/2015/wordml/symex" xmlns:wpg="http://schemas.microsoft.com/office/word/2010/wordprocessingGroup" xmlns:wpi="http://schemas.microsoft.com/office/word/2010/wordprocessingInk" xmlns:wne="http://schemas.microsoft.com/office/word/2006/wordml" xmlns:wps="http://schemas.microsoft.com/office/word/2010/wordprocessingShape" mc:Ignorable="w14 w15 w16se w16cid w16 w16cex w16sdtdh wp14">
+<w:numbering xmlns:wpc="http://schemas.microsoft.com/office/word/2010/wordprocessingCanvas" xmlns:cx="http://schemas.microsoft.com/office/drawing/2014/chartex" xmlns:cx1="http://schemas.microsoft.com/office/drawing/2015/9/8/chartex" xmlns:cx2="http://schemas.microsoft.com/office/drawing/2015/10/21/chartex" xmlns:cx3="http://schemas.microsoft.com/office/drawing/2016/5/9/chartex" xmlns:cx4="http://schemas.microsoft.com/office/drawing/2016/5/10/chartex" xmlns:cx5="http://schemas.microsoft.com/office/drawing/2016/5/11/chartex" xmlns:cx6="http://schemas.microsoft.com/office/drawing/2016/5/12/chartex" xmlns:cx7="http://schemas.microsoft.com/office/drawing/2016/5/13/chartex" xmlns:cx8="http://schemas.microsoft.com/office/drawing/2016/5/14/chartex" xmlns:mc="http://schemas.openxmlformats.org/markup-compatibility/2006" xmlns:aink="http://schemas.microsoft.com/office/drawing/2016/ink" xmlns:am3d="http://schemas.microsoft.com/office/drawing/2017/model3d" xmlns:o="urn:schemas-microsoft-com:office:office" xmlns:oel="http://schemas.microsoft.com/office/2019/extlst" xmlns:r="http://schemas.openxmlformats.org/officeDocument/2006/relationships" xmlns:m="http://schemas.openxmlformats.org/officeDocument/2006/math" xmlns:v="urn:schemas-microsoft-com:vml" xmlns:wp14="http://schemas.microsoft.com/office/word/2010/wordprocessingDrawing" xmlns:wp="http://schemas.openxmlformats.org/drawingml/2006/wordprocessingDrawing" xmlns:w10="urn:schemas-microsoft-com:office:word" xmlns:w="http://schemas.openxmlformats.org/wordprocessingml/2006/main" xmlns:w14="http://schemas.microsoft.com/office/word/2010/wordml" xmlns:w15="http://schemas.microsoft.com/office/word/2012/wordml" xmlns:w16cex="http://schemas.microsoft.com/office/word/2018/wordml/cex" xmlns:w16cid="http://schemas.microsoft.com/office/word/2016/wordml/cid" xmlns:w16="http://schemas.microsoft.com/office/word/2018/wordml" xmlns:w16du="http://schemas.microsoft.com/office/word/2023/wordml/word16du" xmlns:w16sdtdh="http://schemas.microsoft.com/office/word/2020/wordml/sdtdatahash" xmlns:w16sdtfl="http://schemas.microsoft.com/office/word/2024/wordml/sdtformatlock" xmlns:w16se="http://schemas.microsoft.com/office/word/2015/wordml/symex" xmlns:wpg="http://schemas.microsoft.com/office/word/2010/wordprocessingGroup" xmlns:wpi="http://schemas.microsoft.com/office/word/2010/wordprocessingInk" xmlns:wne="http://schemas.microsoft.com/office/word/2006/wordml" xmlns:wps="http://schemas.microsoft.com/office/word/2010/wordprocessingShape" mc:Ignorable="w14 w15 w16se w16cid w16 w16cex w16sdtdh w16sdtfl w16du wp14">
   <w:abstractNum w:abstractNumId="0" w15:restartNumberingAfterBreak="0">
     <w:nsid w:val="0F3351EE"/>
     <w:multiLevelType w:val="hybridMultilevel"/>
@@ -14197,6 +15271,60 @@
     </w:lvl>
   </w:abstractNum>
   <w:abstractNum w:abstractNumId="1" w15:restartNumberingAfterBreak="0">
+    <w:nsid w:val="142B600B"/>
+    <w:multiLevelType w:val="hybridMultilevel"/>
+    <w:tmpl w:val="A92C6CCE"/>
+    <w:lvl w:ilvl="0" w:tplc="BCE2D5A8">
+      <w:start w:val="1"/>
+      <w:numFmt w:val="decimal"/>
+      <w:lvlText w:val="%1."/>
+      <w:lvlJc w:val="left"/>
+      <w:pPr>
+        <w:ind w:left="720" w:hanging="360"/>
+      </w:pPr>
+    </w:lvl>
+    <w:lvl w:ilvl="1" w:tplc="389C4562">
+      <w:numFmt w:val="decimal"/>
+      <w:lvlText w:val=""/>
+      <w:lvlJc w:val="left"/>
+    </w:lvl>
+    <w:lvl w:ilvl="2" w:tplc="50DEC07C">
+      <w:numFmt w:val="decimal"/>
+      <w:lvlText w:val=""/>
+      <w:lvlJc w:val="left"/>
+    </w:lvl>
+    <w:lvl w:ilvl="3" w:tplc="C9D45134">
+      <w:numFmt w:val="decimal"/>
+      <w:lvlText w:val=""/>
+      <w:lvlJc w:val="left"/>
+    </w:lvl>
+    <w:lvl w:ilvl="4" w:tplc="BAF6E0FE">
+      <w:numFmt w:val="decimal"/>
+      <w:lvlText w:val=""/>
+      <w:lvlJc w:val="left"/>
+    </w:lvl>
+    <w:lvl w:ilvl="5" w:tplc="113C8EFA">
+      <w:numFmt w:val="decimal"/>
+      <w:lvlText w:val=""/>
+      <w:lvlJc w:val="left"/>
+    </w:lvl>
+    <w:lvl w:ilvl="6" w:tplc="7F52E2D8">
+      <w:numFmt w:val="decimal"/>
+      <w:lvlText w:val=""/>
+      <w:lvlJc w:val="left"/>
+    </w:lvl>
+    <w:lvl w:ilvl="7" w:tplc="2B90BA38">
+      <w:numFmt w:val="decimal"/>
+      <w:lvlText w:val=""/>
+      <w:lvlJc w:val="left"/>
+    </w:lvl>
+    <w:lvl w:ilvl="8" w:tplc="9D4AAABC">
+      <w:numFmt w:val="decimal"/>
+      <w:lvlText w:val=""/>
+      <w:lvlJc w:val="left"/>
+    </w:lvl>
+  </w:abstractNum>
+  <w:abstractNum w:abstractNumId="2" w15:restartNumberingAfterBreak="0">
     <w:nsid w:val="20297E61"/>
     <w:multiLevelType w:val="hybridMultilevel"/>
     <w:tmpl w:val="BE545076"/>
@@ -14250,7 +15378,97 @@
       <w:lvlJc w:val="left"/>
     </w:lvl>
   </w:abstractNum>
-  <w:abstractNum w:abstractNumId="2" w15:restartNumberingAfterBreak="0">
+  <w:abstractNum w:abstractNumId="3" w15:restartNumberingAfterBreak="0">
+    <w:nsid w:val="302235F5"/>
+    <w:multiLevelType w:val="hybridMultilevel"/>
+    <w:tmpl w:val="2AEE686E"/>
+    <w:lvl w:ilvl="0" w:tplc="AD8C6048">
+      <w:start w:val="10"/>
+      <w:numFmt w:val="decimal"/>
+      <w:lvlText w:val="%1"/>
+      <w:lvlJc w:val="left"/>
+      <w:pPr>
+        <w:ind w:left="720" w:hanging="360"/>
+      </w:pPr>
+      <w:rPr>
+        <w:rFonts w:ascii="Arial" w:eastAsia="Arial" w:hAnsi="Arial" w:cs="Arial" w:hint="default"/>
+        <w:sz w:val="22"/>
+      </w:rPr>
+    </w:lvl>
+    <w:lvl w:ilvl="1" w:tplc="200A0019" w:tentative="1">
+      <w:start w:val="1"/>
+      <w:numFmt w:val="lowerLetter"/>
+      <w:lvlText w:val="%2."/>
+      <w:lvlJc w:val="left"/>
+      <w:pPr>
+        <w:ind w:left="1440" w:hanging="360"/>
+      </w:pPr>
+    </w:lvl>
+    <w:lvl w:ilvl="2" w:tplc="200A001B" w:tentative="1">
+      <w:start w:val="1"/>
+      <w:numFmt w:val="lowerRoman"/>
+      <w:lvlText w:val="%3."/>
+      <w:lvlJc w:val="right"/>
+      <w:pPr>
+        <w:ind w:left="2160" w:hanging="180"/>
+      </w:pPr>
+    </w:lvl>
+    <w:lvl w:ilvl="3" w:tplc="200A000F" w:tentative="1">
+      <w:start w:val="1"/>
+      <w:numFmt w:val="decimal"/>
+      <w:lvlText w:val="%4."/>
+      <w:lvlJc w:val="left"/>
+      <w:pPr>
+        <w:ind w:left="2880" w:hanging="360"/>
+      </w:pPr>
+    </w:lvl>
+    <w:lvl w:ilvl="4" w:tplc="200A0019" w:tentative="1">
+      <w:start w:val="1"/>
+      <w:numFmt w:val="lowerLetter"/>
+      <w:lvlText w:val="%5."/>
+      <w:lvlJc w:val="left"/>
+      <w:pPr>
+        <w:ind w:left="3600" w:hanging="360"/>
+      </w:pPr>
+    </w:lvl>
+    <w:lvl w:ilvl="5" w:tplc="200A001B" w:tentative="1">
+      <w:start w:val="1"/>
+      <w:numFmt w:val="lowerRoman"/>
+      <w:lvlText w:val="%6."/>
+      <w:lvlJc w:val="right"/>
+      <w:pPr>
+        <w:ind w:left="4320" w:hanging="180"/>
+      </w:pPr>
+    </w:lvl>
+    <w:lvl w:ilvl="6" w:tplc="200A000F" w:tentative="1">
+      <w:start w:val="1"/>
+      <w:numFmt w:val="decimal"/>
+      <w:lvlText w:val="%7."/>
+      <w:lvlJc w:val="left"/>
+      <w:pPr>
+        <w:ind w:left="5040" w:hanging="360"/>
+      </w:pPr>
+    </w:lvl>
+    <w:lvl w:ilvl="7" w:tplc="200A0019" w:tentative="1">
+      <w:start w:val="1"/>
+      <w:numFmt w:val="lowerLetter"/>
+      <w:lvlText w:val="%8."/>
+      <w:lvlJc w:val="left"/>
+      <w:pPr>
+        <w:ind w:left="5760" w:hanging="360"/>
+      </w:pPr>
+    </w:lvl>
+    <w:lvl w:ilvl="8" w:tplc="200A001B" w:tentative="1">
+      <w:start w:val="1"/>
+      <w:numFmt w:val="lowerRoman"/>
+      <w:lvlText w:val="%9."/>
+      <w:lvlJc w:val="right"/>
+      <w:pPr>
+        <w:ind w:left="6480" w:hanging="180"/>
+      </w:pPr>
+    </w:lvl>
+  </w:abstractNum>
+  <w:abstractNum w:abstractNumId="4" w15:restartNumberingAfterBreak="0">
     <w:nsid w:val="4DFC7A20"/>
     <w:multiLevelType w:val="hybridMultilevel"/>
     <w:tmpl w:val="F82E8014"/>
@@ -14304,10 +15522,10 @@
       <w:lvlJc w:val="left"/>
     </w:lvl>
   </w:abstractNum>
-  <w:abstractNum w:abstractNumId="3" w15:restartNumberingAfterBreak="0">
-    <w:nsid w:val="6E3E20E3"/>
+  <w:abstractNum w:abstractNumId="5" w15:restartNumberingAfterBreak="0">
+    <w:nsid w:val="55DB0671"/>
     <w:multiLevelType w:val="hybridMultilevel"/>
-    <w:tmpl w:val="958C9B42"/>
+    <w:tmpl w:val="A92C6CCE"/>
     <w:lvl w:ilvl="0" w:tplc="FFFFFFFF">
       <w:start w:val="1"/>
       <w:numFmt w:val="decimal"/>
@@ -14358,7 +15576,61 @@
       <w:lvlJc w:val="left"/>
     </w:lvl>
   </w:abstractNum>
-  <w:abstractNum w:abstractNumId="4" w15:restartNumberingAfterBreak="0">
+  <w:abstractNum w:abstractNumId="6" w15:restartNumberingAfterBreak="0">
+    <w:nsid w:val="6E3E20E3"/>
+    <w:multiLevelType w:val="hybridMultilevel"/>
+    <w:tmpl w:val="958C9B42"/>
+    <w:lvl w:ilvl="0" w:tplc="FFFFFFFF">
+      <w:start w:val="1"/>
+      <w:numFmt w:val="decimal"/>
+      <w:lvlText w:val="%1."/>
+      <w:lvlJc w:val="left"/>
+      <w:pPr>
+        <w:ind w:left="720" w:hanging="360"/>
+      </w:pPr>
+    </w:lvl>
+    <w:lvl w:ilvl="1" w:tplc="FFFFFFFF">
+      <w:numFmt w:val="decimal"/>
+      <w:lvlText w:val=""/>
+      <w:lvlJc w:val="left"/>
+    </w:lvl>
+    <w:lvl w:ilvl="2" w:tplc="FFFFFFFF">
+      <w:numFmt w:val="decimal"/>
+      <w:lvlText w:val=""/>
+      <w:lvlJc w:val="left"/>
+    </w:lvl>
+    <w:lvl w:ilvl="3" w:tplc="FFFFFFFF">
+      <w:numFmt w:val="decimal"/>
+      <w:lvlText w:val=""/>
+      <w:lvlJc w:val="left"/>
+    </w:lvl>
+    <w:lvl w:ilvl="4" w:tplc="FFFFFFFF">
+      <w:numFmt w:val="decimal"/>
+      <w:lvlText w:val=""/>
+      <w:lvlJc w:val="left"/>
+    </w:lvl>
+    <w:lvl w:ilvl="5" w:tplc="FFFFFFFF">
+      <w:numFmt w:val="decimal"/>
+      <w:lvlText w:val=""/>
+      <w:lvlJc w:val="left"/>
+    </w:lvl>
+    <w:lvl w:ilvl="6" w:tplc="FFFFFFFF">
+      <w:numFmt w:val="decimal"/>
+      <w:lvlText w:val=""/>
+      <w:lvlJc w:val="left"/>
+    </w:lvl>
+    <w:lvl w:ilvl="7" w:tplc="FFFFFFFF">
+      <w:numFmt w:val="decimal"/>
+      <w:lvlText w:val=""/>
+      <w:lvlJc w:val="left"/>
+    </w:lvl>
+    <w:lvl w:ilvl="8" w:tplc="FFFFFFFF">
+      <w:numFmt w:val="decimal"/>
+      <w:lvlText w:val=""/>
+      <w:lvlJc w:val="left"/>
+    </w:lvl>
+  </w:abstractNum>
+  <w:abstractNum w:abstractNumId="7" w15:restartNumberingAfterBreak="0">
     <w:nsid w:val="74F93EE6"/>
     <w:multiLevelType w:val="hybridMultilevel"/>
     <w:tmpl w:val="958C9B42"/>
@@ -14413,7 +15685,7 @@
     </w:lvl>
   </w:abstractNum>
   <w:num w:numId="1" w16cid:durableId="127357912">
-    <w:abstractNumId w:val="2"/>
+    <w:abstractNumId w:val="4"/>
     <w:lvlOverride w:ilvl="0">
       <w:startOverride w:val="1"/>
     </w:lvlOverride>
@@ -14428,25 +15700,40 @@
     <w:abstractNumId w:val="0"/>
   </w:num>
   <w:num w:numId="4" w16cid:durableId="822744504">
-    <w:abstractNumId w:val="1"/>
+    <w:abstractNumId w:val="2"/>
   </w:num>
   <w:num w:numId="5" w16cid:durableId="1770732147">
-    <w:abstractNumId w:val="4"/>
+    <w:abstractNumId w:val="7"/>
     <w:lvlOverride w:ilvl="0">
       <w:startOverride w:val="1"/>
     </w:lvlOverride>
   </w:num>
   <w:num w:numId="6" w16cid:durableId="1468664363">
-    <w:abstractNumId w:val="4"/>
+    <w:abstractNumId w:val="7"/>
   </w:num>
   <w:num w:numId="7" w16cid:durableId="1266769754">
+    <w:abstractNumId w:val="6"/>
+  </w:num>
+  <w:num w:numId="8" w16cid:durableId="2070298722">
+    <w:abstractNumId w:val="1"/>
+    <w:lvlOverride w:ilvl="0">
+      <w:startOverride w:val="1"/>
+    </w:lvlOverride>
+  </w:num>
+  <w:num w:numId="9" w16cid:durableId="1348486157">
+    <w:abstractNumId w:val="1"/>
+  </w:num>
+  <w:num w:numId="10" w16cid:durableId="1183859211">
+    <w:abstractNumId w:val="5"/>
+  </w:num>
+  <w:num w:numId="11" w16cid:durableId="223223781">
     <w:abstractNumId w:val="3"/>
   </w:num>
 </w:numbering>
 </file>
 
 <file path=word/styles.xml><?xml version="1.0" encoding="utf-8"?>
-<w:styles xmlns:mc="http://schemas.openxmlformats.org/markup-compatibility/2006" xmlns:r="http://schemas.openxmlformats.org/officeDocument/2006/relationships" xmlns:w="http://schemas.openxmlformats.org/wordprocessingml/2006/main" xmlns:w14="http://schemas.microsoft.com/office/word/2010/wordml" xmlns:w15="http://schemas.microsoft.com/office/word/2012/wordml" xmlns:w16cex="http://schemas.microsoft.com/office/word/2018/wordml/cex" xmlns:w16cid="http://schemas.microsoft.com/office/word/2016/wordml/cid" xmlns:w16="http://schemas.microsoft.com/office/word/2018/wordml" xmlns:w16sdtdh="http://schemas.microsoft.com/office/word/2020/wordml/sdtdatahash" xmlns:w16se="http://schemas.microsoft.com/office/word/2015/wordml/symex" mc:Ignorable="w14 w15 w16se w16cid w16 w16cex w16sdtdh">
+<w:styles xmlns:mc="http://schemas.openxmlformats.org/markup-compatibility/2006" xmlns:r="http://schemas.openxmlformats.org/officeDocument/2006/relationships" xmlns:w="http://schemas.openxmlformats.org/wordprocessingml/2006/main" xmlns:w14="http://schemas.microsoft.com/office/word/2010/wordml" xmlns:w15="http://schemas.microsoft.com/office/word/2012/wordml" xmlns:w16cex="http://schemas.microsoft.com/office/word/2018/wordml/cex" xmlns:w16cid="http://schemas.microsoft.com/office/word/2016/wordml/cid" xmlns:w16="http://schemas.microsoft.com/office/word/2018/wordml" xmlns:w16du="http://schemas.microsoft.com/office/word/2023/wordml/word16du" xmlns:w16sdtdh="http://schemas.microsoft.com/office/word/2020/wordml/sdtdatahash" xmlns:w16sdtfl="http://schemas.microsoft.com/office/word/2024/wordml/sdtformatlock" xmlns:w16se="http://schemas.microsoft.com/office/word/2015/wordml/symex" mc:Ignorable="w14 w15 w16se w16cid w16 w16cex w16sdtdh w16sdtfl w16du">
   <w:docDefaults>
     <w:rPrDefault>
       <w:rPr>

</xml_diff>

<commit_message>
Añadiendo scipt,organizando,añadiendo version en pdf del trabajo
</commit_message>
<xml_diff>
--- a/Sistemas operativos practica 3.docx
+++ b/Sistemas operativos practica 3.docx
@@ -1668,7 +1668,7 @@
           <w:szCs w:val="20"/>
         </w:rPr>
         <w:drawing>
-          <wp:anchor distT="0" distB="0" distL="114300" distR="114300" simplePos="0" relativeHeight="251660288" behindDoc="0" locked="0" layoutInCell="1" allowOverlap="1" wp14:anchorId="26CB8897" wp14:editId="3F5020D3">
+          <wp:anchor distT="0" distB="0" distL="114300" distR="114300" simplePos="0" relativeHeight="251660288" behindDoc="0" locked="0" layoutInCell="1" allowOverlap="1" wp14:anchorId="26CB8897" wp14:editId="318229EB">
             <wp:simplePos x="0" y="0"/>
             <wp:positionH relativeFrom="margin">
               <wp:posOffset>16048</wp:posOffset>
@@ -9373,103 +9373,128 @@
     <w:p>
       <w:pPr>
         <w:pStyle w:val="Prrafodelista"/>
-        <w:numPr>
-          <w:ilvl w:val="0"/>
-          <w:numId w:val="11"/>
-        </w:numPr>
-        <w:spacing w:before="60" w:after="60" w:line="240" w:lineRule="auto"/>
-        <w:rPr>
-          <w:sz w:val="20"/>
-          <w:szCs w:val="20"/>
-        </w:rPr>
-      </w:pPr>
-      <w:r>
-        <w:rPr>
-          <w:rFonts w:ascii="Arial" w:eastAsia="Arial" w:hAnsi="Arial" w:cs="Arial"/>
-          <w:sz w:val="20"/>
-          <w:szCs w:val="20"/>
-        </w:rPr>
-        <w:t xml:space="preserve">Para cada dispositivo </w:t>
-      </w:r>
-      <w:proofErr w:type="spellStart"/>
-      <w:r>
-        <w:rPr>
-          <w:rFonts w:ascii="Arial" w:eastAsia="Arial" w:hAnsi="Arial" w:cs="Arial"/>
-          <w:sz w:val="20"/>
-          <w:szCs w:val="20"/>
-        </w:rPr>
-        <w:t>VirtIO</w:t>
-      </w:r>
-      <w:proofErr w:type="spellEnd"/>
-      <w:r>
-        <w:rPr>
-          <w:rFonts w:ascii="Arial" w:eastAsia="Arial" w:hAnsi="Arial" w:cs="Arial"/>
-          <w:sz w:val="20"/>
-          <w:szCs w:val="20"/>
-        </w:rPr>
-        <w:t xml:space="preserve"> identificado, ejecutar </w:t>
-      </w:r>
-      <w:proofErr w:type="spellStart"/>
-      <w:r>
-        <w:rPr>
-          <w:rFonts w:ascii="Arial" w:eastAsia="Arial" w:hAnsi="Arial" w:cs="Arial"/>
-          <w:sz w:val="20"/>
-          <w:szCs w:val="20"/>
-        </w:rPr>
-        <w:t>lsmod</w:t>
-      </w:r>
-      <w:proofErr w:type="spellEnd"/>
-      <w:r>
-        <w:rPr>
-          <w:rFonts w:ascii="Arial" w:eastAsia="Arial" w:hAnsi="Arial" w:cs="Arial"/>
-          <w:sz w:val="20"/>
-          <w:szCs w:val="20"/>
-        </w:rPr>
-        <w:t xml:space="preserve"> | grep </w:t>
-      </w:r>
-      <w:proofErr w:type="spellStart"/>
-      <w:r>
-        <w:rPr>
-          <w:rFonts w:ascii="Arial" w:eastAsia="Arial" w:hAnsi="Arial" w:cs="Arial"/>
-          <w:sz w:val="20"/>
-          <w:szCs w:val="20"/>
-        </w:rPr>
-        <w:t>virtio</w:t>
-      </w:r>
-      <w:proofErr w:type="spellEnd"/>
-      <w:r>
-        <w:rPr>
-          <w:rFonts w:ascii="Arial" w:eastAsia="Arial" w:hAnsi="Arial" w:cs="Arial"/>
-          <w:sz w:val="20"/>
-          <w:szCs w:val="20"/>
-        </w:rPr>
-        <w:t xml:space="preserve"> y </w:t>
-      </w:r>
-      <w:proofErr w:type="spellStart"/>
-      <w:r>
-        <w:rPr>
-          <w:rFonts w:ascii="Arial" w:eastAsia="Arial" w:hAnsi="Arial" w:cs="Arial"/>
-          <w:sz w:val="20"/>
-          <w:szCs w:val="20"/>
-        </w:rPr>
-        <w:t>modinfo</w:t>
-      </w:r>
-      <w:proofErr w:type="spellEnd"/>
-      <w:r>
-        <w:rPr>
-          <w:rFonts w:ascii="Arial" w:eastAsia="Arial" w:hAnsi="Arial" w:cs="Arial"/>
-          <w:sz w:val="20"/>
-          <w:szCs w:val="20"/>
-        </w:rPr>
-        <w:t xml:space="preserve"> del módulo correspondiente</w:t>
-      </w:r>
+        <w:spacing w:before="60" w:after="60" w:line="240" w:lineRule="auto"/>
+        <w:contextualSpacing w:val="0"/>
+        <w:rPr>
+          <w:rFonts w:ascii="Arial" w:eastAsia="Arial" w:hAnsi="Arial" w:cs="Arial"/>
+          <w:sz w:val="20"/>
+          <w:szCs w:val="20"/>
+        </w:rPr>
+      </w:pPr>
+      <w:r>
+        <w:rPr>
+          <w:rFonts w:ascii="Arial" w:eastAsia="Arial" w:hAnsi="Arial" w:cs="Arial"/>
+          <w:sz w:val="20"/>
+          <w:szCs w:val="20"/>
+        </w:rPr>
+        <w:t xml:space="preserve">10 </w:t>
+      </w:r>
+      <w:r>
+        <w:rPr>
+          <w:rFonts w:ascii="Arial" w:eastAsia="Arial" w:hAnsi="Arial" w:cs="Arial"/>
+          <w:sz w:val="20"/>
+          <w:szCs w:val="20"/>
+        </w:rPr>
+        <w:t>y</w:t>
+      </w:r>
+      <w:r>
+        <w:rPr>
+          <w:rFonts w:ascii="Arial" w:eastAsia="Arial" w:hAnsi="Arial" w:cs="Arial"/>
+          <w:sz w:val="20"/>
+          <w:szCs w:val="20"/>
+        </w:rPr>
+        <w:t xml:space="preserve"> </w:t>
+      </w:r>
+      <w:r>
+        <w:rPr>
+          <w:rFonts w:ascii="Arial" w:eastAsia="Arial" w:hAnsi="Arial" w:cs="Arial"/>
+          <w:sz w:val="20"/>
+          <w:szCs w:val="20"/>
+        </w:rPr>
+        <w:t>11 Al</w:t>
+      </w:r>
+      <w:r>
+        <w:rPr>
+          <w:rFonts w:ascii="Arial" w:eastAsia="Arial" w:hAnsi="Arial" w:cs="Arial"/>
+          <w:sz w:val="20"/>
+          <w:szCs w:val="20"/>
+        </w:rPr>
+        <w:t xml:space="preserve"> no poseer dispositivos </w:t>
+      </w:r>
+      <w:proofErr w:type="spellStart"/>
+      <w:proofErr w:type="gramStart"/>
+      <w:r>
+        <w:rPr>
+          <w:rFonts w:ascii="Arial" w:eastAsia="Arial" w:hAnsi="Arial" w:cs="Arial"/>
+          <w:sz w:val="20"/>
+          <w:szCs w:val="20"/>
+        </w:rPr>
+        <w:t>virtlo</w:t>
+      </w:r>
+      <w:proofErr w:type="spellEnd"/>
+      <w:r>
+        <w:rPr>
+          <w:rFonts w:ascii="Arial" w:eastAsia="Arial" w:hAnsi="Arial" w:cs="Arial"/>
+          <w:sz w:val="20"/>
+          <w:szCs w:val="20"/>
+        </w:rPr>
+        <w:t>(</w:t>
+      </w:r>
+      <w:proofErr w:type="spellStart"/>
+      <w:proofErr w:type="gramEnd"/>
+      <w:r>
+        <w:rPr>
+          <w:rFonts w:ascii="Arial" w:eastAsia="Arial" w:hAnsi="Arial" w:cs="Arial"/>
+          <w:sz w:val="20"/>
+          <w:szCs w:val="20"/>
+        </w:rPr>
+        <w:t>Paravirtualizados</w:t>
+      </w:r>
+      <w:proofErr w:type="spellEnd"/>
+      <w:r>
+        <w:rPr>
+          <w:rFonts w:ascii="Arial" w:eastAsia="Arial" w:hAnsi="Arial" w:cs="Arial"/>
+          <w:sz w:val="20"/>
+          <w:szCs w:val="20"/>
+        </w:rPr>
+        <w:t xml:space="preserve">) no se puede responder las </w:t>
+      </w:r>
+      <w:r>
+        <w:rPr>
+          <w:rFonts w:ascii="Arial" w:eastAsia="Arial" w:hAnsi="Arial" w:cs="Arial"/>
+          <w:sz w:val="20"/>
+          <w:szCs w:val="20"/>
+        </w:rPr>
+        <w:t>2</w:t>
+      </w:r>
+      <w:proofErr w:type="gramStart"/>
+      <w:r>
+        <w:rPr>
+          <w:rFonts w:ascii="Arial" w:eastAsia="Arial" w:hAnsi="Arial" w:cs="Arial"/>
+          <w:sz w:val="20"/>
+          <w:szCs w:val="20"/>
+        </w:rPr>
+        <w:t>preguntas .</w:t>
+      </w:r>
+      <w:proofErr w:type="gramEnd"/>
+    </w:p>
+    <w:p>
+      <w:pPr>
+        <w:pStyle w:val="Prrafodelista"/>
+        <w:spacing w:before="60" w:after="60" w:line="240" w:lineRule="auto"/>
+        <w:contextualSpacing w:val="0"/>
+        <w:rPr>
+          <w:sz w:val="20"/>
+          <w:szCs w:val="20"/>
+        </w:rPr>
+      </w:pPr>
     </w:p>
     <w:p>
       <w:pPr>
         <w:pStyle w:val="Prrafodelista"/>
         <w:numPr>
           <w:ilvl w:val="0"/>
-          <w:numId w:val="11"/>
+          <w:numId w:val="13"/>
         </w:numPr>
         <w:spacing w:before="60" w:after="60" w:line="240" w:lineRule="auto"/>
         <w:rPr>
@@ -9483,83 +9508,6 @@
           <w:sz w:val="20"/>
           <w:szCs w:val="20"/>
         </w:rPr>
-        <w:t xml:space="preserve">Comparar en </w:t>
-      </w:r>
-      <w:proofErr w:type="spellStart"/>
-      <w:r>
-        <w:rPr>
-          <w:rFonts w:ascii="Arial" w:eastAsia="Arial" w:hAnsi="Arial" w:cs="Arial"/>
-          <w:sz w:val="20"/>
-          <w:szCs w:val="20"/>
-        </w:rPr>
-        <w:t>dmesg</w:t>
-      </w:r>
-      <w:proofErr w:type="spellEnd"/>
-      <w:r>
-        <w:rPr>
-          <w:rFonts w:ascii="Arial" w:eastAsia="Arial" w:hAnsi="Arial" w:cs="Arial"/>
-          <w:sz w:val="20"/>
-          <w:szCs w:val="20"/>
-        </w:rPr>
-        <w:t xml:space="preserve"> los mensajes de inicialización de un dispositivo emulado vs uno </w:t>
-      </w:r>
-      <w:proofErr w:type="spellStart"/>
-      <w:r>
-        <w:rPr>
-          <w:rFonts w:ascii="Arial" w:eastAsia="Arial" w:hAnsi="Arial" w:cs="Arial"/>
-          <w:sz w:val="20"/>
-          <w:szCs w:val="20"/>
-        </w:rPr>
-        <w:t>VirtIO</w:t>
-      </w:r>
-      <w:proofErr w:type="spellEnd"/>
-      <w:r>
-        <w:rPr>
-          <w:rFonts w:ascii="Arial" w:eastAsia="Arial" w:hAnsi="Arial" w:cs="Arial"/>
-          <w:sz w:val="20"/>
-          <w:szCs w:val="20"/>
-        </w:rPr>
-        <w:t xml:space="preserve">. ¿Cuál genera más líneas? ¿Qué implica eso sobre el </w:t>
-      </w:r>
-      <w:proofErr w:type="spellStart"/>
-      <w:r>
-        <w:rPr>
-          <w:rFonts w:ascii="Arial" w:eastAsia="Arial" w:hAnsi="Arial" w:cs="Arial"/>
-          <w:sz w:val="20"/>
-          <w:szCs w:val="20"/>
-        </w:rPr>
-        <w:t>overhead</w:t>
-      </w:r>
-      <w:proofErr w:type="spellEnd"/>
-      <w:r>
-        <w:rPr>
-          <w:rFonts w:ascii="Arial" w:eastAsia="Arial" w:hAnsi="Arial" w:cs="Arial"/>
-          <w:sz w:val="20"/>
-          <w:szCs w:val="20"/>
-        </w:rPr>
-        <w:t xml:space="preserve"> de la emulación completa?</w:t>
-      </w:r>
-    </w:p>
-    <w:p>
-      <w:pPr>
-        <w:pStyle w:val="Prrafodelista"/>
-        <w:numPr>
-          <w:ilvl w:val="0"/>
-          <w:numId w:val="11"/>
-        </w:numPr>
-        <w:spacing w:before="60" w:after="60" w:line="240" w:lineRule="auto"/>
-        <w:contextualSpacing w:val="0"/>
-        <w:rPr>
-          <w:sz w:val="20"/>
-          <w:szCs w:val="20"/>
-        </w:rPr>
-      </w:pPr>
-      <w:r>
-        <w:rPr>
-          <w:rFonts w:ascii="Arial" w:eastAsia="Arial" w:hAnsi="Arial" w:cs="Arial"/>
-          <w:sz w:val="20"/>
-          <w:szCs w:val="20"/>
-        </w:rPr>
         <w:t xml:space="preserve">Explicar con evidencia propia del laboratorio: ¿por qué la </w:t>
       </w:r>
       <w:proofErr w:type="spellStart"/>
@@ -9583,59 +9531,135 @@
     </w:p>
     <w:p>
       <w:pPr>
-        <w:pStyle w:val="Prrafodelista"/>
-        <w:spacing w:before="60" w:after="60" w:line="240" w:lineRule="auto"/>
-        <w:contextualSpacing w:val="0"/>
-        <w:rPr>
-          <w:sz w:val="20"/>
-          <w:szCs w:val="20"/>
-        </w:rPr>
-      </w:pPr>
-      <w:r>
-        <w:rPr>
-          <w:rFonts w:ascii="Arial" w:eastAsia="Arial" w:hAnsi="Arial" w:cs="Arial"/>
-          <w:sz w:val="20"/>
-          <w:szCs w:val="20"/>
-        </w:rPr>
-        <w:t xml:space="preserve">Al no poseer dispositivos </w:t>
-      </w:r>
-      <w:proofErr w:type="spellStart"/>
-      <w:proofErr w:type="gramStart"/>
-      <w:r>
-        <w:rPr>
-          <w:rFonts w:ascii="Arial" w:eastAsia="Arial" w:hAnsi="Arial" w:cs="Arial"/>
-          <w:sz w:val="20"/>
-          <w:szCs w:val="20"/>
-        </w:rPr>
-        <w:t>virtlo</w:t>
-      </w:r>
-      <w:proofErr w:type="spellEnd"/>
-      <w:r>
-        <w:rPr>
-          <w:rFonts w:ascii="Arial" w:eastAsia="Arial" w:hAnsi="Arial" w:cs="Arial"/>
-          <w:sz w:val="20"/>
-          <w:szCs w:val="20"/>
-        </w:rPr>
-        <w:t>(</w:t>
-      </w:r>
-      <w:proofErr w:type="spellStart"/>
-      <w:proofErr w:type="gramEnd"/>
-      <w:r>
-        <w:rPr>
-          <w:rFonts w:ascii="Arial" w:eastAsia="Arial" w:hAnsi="Arial" w:cs="Arial"/>
-          <w:sz w:val="20"/>
-          <w:szCs w:val="20"/>
-        </w:rPr>
-        <w:t>Paravirtualizados</w:t>
-      </w:r>
-      <w:proofErr w:type="spellEnd"/>
-      <w:r>
-        <w:rPr>
-          <w:rFonts w:ascii="Arial" w:eastAsia="Arial" w:hAnsi="Arial" w:cs="Arial"/>
-          <w:sz w:val="20"/>
-          <w:szCs w:val="20"/>
-        </w:rPr>
-        <w:t>) no se puede responder las 3 preguntas anteriores.</w:t>
+        <w:spacing w:before="60" w:after="60" w:line="240" w:lineRule="auto"/>
+        <w:ind w:left="360"/>
+        <w:rPr>
+          <w:sz w:val="20"/>
+          <w:szCs w:val="20"/>
+        </w:rPr>
+      </w:pPr>
+      <w:r>
+        <w:rPr>
+          <w:rFonts w:ascii="Arial" w:eastAsia="Arial" w:hAnsi="Arial" w:cs="Arial"/>
+          <w:sz w:val="20"/>
+          <w:szCs w:val="20"/>
+        </w:rPr>
+        <w:t xml:space="preserve"> </w:t>
+      </w:r>
+      <w:r>
+        <w:rPr>
+          <w:rFonts w:ascii="Arial" w:eastAsia="Arial" w:hAnsi="Arial" w:cs="Arial"/>
+          <w:sz w:val="20"/>
+          <w:szCs w:val="20"/>
+        </w:rPr>
+        <w:t>En la emulación completa (o virtualización</w:t>
+      </w:r>
+      <w:r>
+        <w:rPr>
+          <w:rFonts w:ascii="Arial" w:eastAsia="Arial" w:hAnsi="Arial" w:cs="Arial"/>
+          <w:sz w:val="20"/>
+          <w:szCs w:val="20"/>
+        </w:rPr>
+        <w:t>)</w:t>
+      </w:r>
+      <w:r>
+        <w:rPr>
+          <w:rFonts w:ascii="Arial" w:eastAsia="Arial" w:hAnsi="Arial" w:cs="Arial"/>
+          <w:sz w:val="20"/>
+          <w:szCs w:val="20"/>
+        </w:rPr>
+        <w:t>, el sistema operativo huésped no sabe que está corriendo en una máquina virtual. Cree que interactúa con componentes de hardware físicos y reales</w:t>
+      </w:r>
+      <w:r>
+        <w:rPr>
+          <w:rFonts w:ascii="Arial" w:eastAsia="Arial" w:hAnsi="Arial" w:cs="Arial"/>
+          <w:sz w:val="20"/>
+          <w:szCs w:val="20"/>
+        </w:rPr>
+        <w:t>,</w:t>
+      </w:r>
+      <w:r>
+        <w:t xml:space="preserve"> </w:t>
+      </w:r>
+      <w:r>
+        <w:rPr>
+          <w:rFonts w:ascii="Arial" w:eastAsia="Arial" w:hAnsi="Arial" w:cs="Arial"/>
+          <w:sz w:val="20"/>
+          <w:szCs w:val="20"/>
+        </w:rPr>
+        <w:t xml:space="preserve">VGA compatible </w:t>
+      </w:r>
+      <w:proofErr w:type="spellStart"/>
+      <w:r>
+        <w:rPr>
+          <w:rFonts w:ascii="Arial" w:eastAsia="Arial" w:hAnsi="Arial" w:cs="Arial"/>
+          <w:sz w:val="20"/>
+          <w:szCs w:val="20"/>
+        </w:rPr>
+        <w:t>controller</w:t>
+      </w:r>
+      <w:proofErr w:type="spellEnd"/>
+      <w:r>
+        <w:rPr>
+          <w:rFonts w:ascii="Arial" w:eastAsia="Arial" w:hAnsi="Arial" w:cs="Arial"/>
+          <w:sz w:val="20"/>
+          <w:szCs w:val="20"/>
+        </w:rPr>
+        <w:t xml:space="preserve">: VMware SVGA II </w:t>
+      </w:r>
+      <w:proofErr w:type="spellStart"/>
+      <w:r>
+        <w:rPr>
+          <w:rFonts w:ascii="Arial" w:eastAsia="Arial" w:hAnsi="Arial" w:cs="Arial"/>
+          <w:sz w:val="20"/>
+          <w:szCs w:val="20"/>
+        </w:rPr>
+        <w:t>Adapter</w:t>
+      </w:r>
+      <w:proofErr w:type="spellEnd"/>
+      <w:r>
+        <w:rPr>
+          <w:rFonts w:ascii="Arial" w:eastAsia="Arial" w:hAnsi="Arial" w:cs="Arial"/>
+          <w:sz w:val="20"/>
+          <w:szCs w:val="20"/>
+        </w:rPr>
+        <w:t xml:space="preserve"> es un chip de video que </w:t>
+      </w:r>
+      <w:proofErr w:type="spellStart"/>
+      <w:r>
+        <w:rPr>
+          <w:rFonts w:ascii="Arial" w:eastAsia="Arial" w:hAnsi="Arial" w:cs="Arial"/>
+          <w:sz w:val="20"/>
+          <w:szCs w:val="20"/>
+        </w:rPr>
+        <w:t>nuesta</w:t>
+      </w:r>
+      <w:proofErr w:type="spellEnd"/>
+      <w:r>
+        <w:rPr>
+          <w:rFonts w:ascii="Arial" w:eastAsia="Arial" w:hAnsi="Arial" w:cs="Arial"/>
+          <w:sz w:val="20"/>
+          <w:szCs w:val="20"/>
+        </w:rPr>
+        <w:t xml:space="preserve"> </w:t>
+      </w:r>
+      <w:proofErr w:type="spellStart"/>
+      <w:r>
+        <w:rPr>
+          <w:rFonts w:ascii="Arial" w:eastAsia="Arial" w:hAnsi="Arial" w:cs="Arial"/>
+          <w:sz w:val="20"/>
+          <w:szCs w:val="20"/>
+        </w:rPr>
+        <w:t>vm</w:t>
+      </w:r>
+      <w:proofErr w:type="spellEnd"/>
+      <w:r>
+        <w:rPr>
+          <w:rFonts w:ascii="Arial" w:eastAsia="Arial" w:hAnsi="Arial" w:cs="Arial"/>
+          <w:sz w:val="20"/>
+          <w:szCs w:val="20"/>
+        </w:rPr>
+        <w:t xml:space="preserve"> piensa que tiene, cuando en verdad lo que tiene es un código emulándolo.</w:t>
       </w:r>
     </w:p>
     <w:p>
@@ -14043,7 +14067,7 @@
           <w:noProof/>
         </w:rPr>
         <w:drawing>
-          <wp:anchor distT="0" distB="0" distL="114300" distR="114300" simplePos="0" relativeHeight="251693056" behindDoc="0" locked="0" layoutInCell="1" allowOverlap="1" wp14:anchorId="569B6F48" wp14:editId="0FF82FD8">
+          <wp:anchor distT="0" distB="0" distL="114300" distR="114300" simplePos="0" relativeHeight="251693056" behindDoc="0" locked="0" layoutInCell="1" allowOverlap="1" wp14:anchorId="569B6F48" wp14:editId="51E3F6DC">
             <wp:simplePos x="0" y="0"/>
             <wp:positionH relativeFrom="margin">
               <wp:align>right</wp:align>
@@ -14792,7 +14816,7 @@
         </w:rPr>
         <w:lastRenderedPageBreak/>
         <w:drawing>
-          <wp:anchor distT="0" distB="0" distL="114300" distR="114300" simplePos="0" relativeHeight="251696128" behindDoc="0" locked="0" layoutInCell="1" allowOverlap="1" wp14:anchorId="06651371" wp14:editId="0F50206A">
+          <wp:anchor distT="0" distB="0" distL="114300" distR="114300" simplePos="0" relativeHeight="251696128" behindDoc="0" locked="0" layoutInCell="1" allowOverlap="1" wp14:anchorId="06651371" wp14:editId="6F3B52CA">
             <wp:simplePos x="0" y="0"/>
             <wp:positionH relativeFrom="margin">
               <wp:align>center</wp:align>
@@ -18326,7 +18350,18 @@
           <w:sz w:val="22"/>
           <w:szCs w:val="22"/>
         </w:rPr>
-        <w:t>Pregunta Integradora — responder en el informe (mínimo 200 palabras con evidencia del laboratorio):</w:t>
+        <w:t xml:space="preserve">Pregunta Integradora </w:t>
+      </w:r>
+      <w:r>
+        <w:rPr>
+          <w:rFonts w:ascii="Arial" w:eastAsia="Arial" w:hAnsi="Arial" w:cs="Arial"/>
+          <w:b/>
+          <w:bCs/>
+          <w:color w:val="B7950B"/>
+          <w:sz w:val="22"/>
+          <w:szCs w:val="22"/>
+        </w:rPr>
+        <w:t>— responder en el informe (mínimo 200 palabras con evidencia del laboratorio):</w:t>
       </w:r>
     </w:p>
     <w:p>
@@ -19241,6 +19276,14 @@
           <w:szCs w:val="20"/>
         </w:rPr>
         <w:t>.</w:t>
+      </w:r>
+      <w:r>
+        <w:rPr>
+          <w:rFonts w:ascii="Arial" w:hAnsi="Arial" w:cs="Arial"/>
+          <w:sz w:val="20"/>
+          <w:szCs w:val="20"/>
+        </w:rPr>
+        <w:t xml:space="preserve"> En nuestro caso la pausa no sucedió debido a que existía suficiente entropía.</w:t>
       </w:r>
     </w:p>
     <w:p>
@@ -20156,6 +20199,95 @@
     </w:lvl>
   </w:abstractNum>
   <w:abstractNum w:abstractNumId="7" w15:restartNumberingAfterBreak="0">
+    <w:nsid w:val="6E690E46"/>
+    <w:multiLevelType w:val="hybridMultilevel"/>
+    <w:tmpl w:val="253486F4"/>
+    <w:lvl w:ilvl="0" w:tplc="ED4AF22C">
+      <w:start w:val="12"/>
+      <w:numFmt w:val="decimal"/>
+      <w:lvlText w:val="%1"/>
+      <w:lvlJc w:val="left"/>
+      <w:pPr>
+        <w:ind w:left="720" w:hanging="360"/>
+      </w:pPr>
+      <w:rPr>
+        <w:rFonts w:ascii="Arial" w:eastAsia="Arial" w:hAnsi="Arial" w:cs="Arial" w:hint="default"/>
+      </w:rPr>
+    </w:lvl>
+    <w:lvl w:ilvl="1" w:tplc="200A0019" w:tentative="1">
+      <w:start w:val="1"/>
+      <w:numFmt w:val="lowerLetter"/>
+      <w:lvlText w:val="%2."/>
+      <w:lvlJc w:val="left"/>
+      <w:pPr>
+        <w:ind w:left="1440" w:hanging="360"/>
+      </w:pPr>
+    </w:lvl>
+    <w:lvl w:ilvl="2" w:tplc="200A001B" w:tentative="1">
+      <w:start w:val="1"/>
+      <w:numFmt w:val="lowerRoman"/>
+      <w:lvlText w:val="%3."/>
+      <w:lvlJc w:val="right"/>
+      <w:pPr>
+        <w:ind w:left="2160" w:hanging="180"/>
+      </w:pPr>
+    </w:lvl>
+    <w:lvl w:ilvl="3" w:tplc="200A000F" w:tentative="1">
+      <w:start w:val="1"/>
+      <w:numFmt w:val="decimal"/>
+      <w:lvlText w:val="%4."/>
+      <w:lvlJc w:val="left"/>
+      <w:pPr>
+        <w:ind w:left="2880" w:hanging="360"/>
+      </w:pPr>
+    </w:lvl>
+    <w:lvl w:ilvl="4" w:tplc="200A0019" w:tentative="1">
+      <w:start w:val="1"/>
+      <w:numFmt w:val="lowerLetter"/>
+      <w:lvlText w:val="%5."/>
+      <w:lvlJc w:val="left"/>
+      <w:pPr>
+        <w:ind w:left="3600" w:hanging="360"/>
+      </w:pPr>
+    </w:lvl>
+    <w:lvl w:ilvl="5" w:tplc="200A001B" w:tentative="1">
+      <w:start w:val="1"/>
+      <w:numFmt w:val="lowerRoman"/>
+      <w:lvlText w:val="%6."/>
+      <w:lvlJc w:val="right"/>
+      <w:pPr>
+        <w:ind w:left="4320" w:hanging="180"/>
+      </w:pPr>
+    </w:lvl>
+    <w:lvl w:ilvl="6" w:tplc="200A000F" w:tentative="1">
+      <w:start w:val="1"/>
+      <w:numFmt w:val="decimal"/>
+      <w:lvlText w:val="%7."/>
+      <w:lvlJc w:val="left"/>
+      <w:pPr>
+        <w:ind w:left="5040" w:hanging="360"/>
+      </w:pPr>
+    </w:lvl>
+    <w:lvl w:ilvl="7" w:tplc="200A0019" w:tentative="1">
+      <w:start w:val="1"/>
+      <w:numFmt w:val="lowerLetter"/>
+      <w:lvlText w:val="%8."/>
+      <w:lvlJc w:val="left"/>
+      <w:pPr>
+        <w:ind w:left="5760" w:hanging="360"/>
+      </w:pPr>
+    </w:lvl>
+    <w:lvl w:ilvl="8" w:tplc="200A001B" w:tentative="1">
+      <w:start w:val="1"/>
+      <w:numFmt w:val="lowerRoman"/>
+      <w:lvlText w:val="%9."/>
+      <w:lvlJc w:val="right"/>
+      <w:pPr>
+        <w:ind w:left="6480" w:hanging="180"/>
+      </w:pPr>
+    </w:lvl>
+  </w:abstractNum>
+  <w:abstractNum w:abstractNumId="8" w15:restartNumberingAfterBreak="0">
     <w:nsid w:val="74F93EE6"/>
     <w:multiLevelType w:val="hybridMultilevel"/>
     <w:tmpl w:val="958C9B42"/>
@@ -20209,7 +20341,7 @@
       <w:lvlJc w:val="left"/>
     </w:lvl>
   </w:abstractNum>
-  <w:abstractNum w:abstractNumId="8" w15:restartNumberingAfterBreak="0">
+  <w:abstractNum w:abstractNumId="9" w15:restartNumberingAfterBreak="0">
     <w:nsid w:val="7BFE0911"/>
     <w:multiLevelType w:val="multilevel"/>
     <w:tmpl w:val="F20441F6"/>
@@ -20377,13 +20509,13 @@
     <w:abstractNumId w:val="2"/>
   </w:num>
   <w:num w:numId="5" w16cid:durableId="1770732147">
-    <w:abstractNumId w:val="7"/>
+    <w:abstractNumId w:val="8"/>
     <w:lvlOverride w:ilvl="0">
       <w:startOverride w:val="1"/>
     </w:lvlOverride>
   </w:num>
   <w:num w:numId="6" w16cid:durableId="1468664363">
-    <w:abstractNumId w:val="7"/>
+    <w:abstractNumId w:val="8"/>
   </w:num>
   <w:num w:numId="7" w16cid:durableId="1266769754">
     <w:abstractNumId w:val="6"/>
@@ -20404,7 +20536,10 @@
     <w:abstractNumId w:val="3"/>
   </w:num>
   <w:num w:numId="12" w16cid:durableId="1858428271">
-    <w:abstractNumId w:val="8"/>
+    <w:abstractNumId w:val="9"/>
+  </w:num>
+  <w:num w:numId="13" w16cid:durableId="2077313401">
+    <w:abstractNumId w:val="7"/>
   </w:num>
 </w:numbering>
 </file>
@@ -21013,6 +21148,7 @@
   <w:style w:type="character" w:default="1" w:styleId="Fuentedeprrafopredeter">
     <w:name w:val="Default Paragraph Font"/>
     <w:uiPriority w:val="1"/>
+    <w:semiHidden/>
     <w:unhideWhenUsed/>
   </w:style>
   <w:style w:type="table" w:default="1" w:styleId="Tablanormal">

</xml_diff>